<commit_message>
Project 2 Final Report - updating report
</commit_message>
<xml_diff>
--- a/Project 2/Reports/Project 2 - Final Report.docx
+++ b/Project 2/Reports/Project 2 - Final Report.docx
@@ -100,7 +100,43 @@
         <w:rPr>
           <w:rFonts w:asciiTheme="majorBidi" w:hAnsiTheme="majorBidi" w:cstheme="majorBidi"/>
         </w:rPr>
-        <w:t xml:space="preserve">We will fit separate linear regression models for each of the six outcomes of interest, the five cognitive measures (listed in Table 3) and cortical thickness. Each model will examine change from baseline to one-year follow-up in the respective outcome, while adjusting for the corresponding baseline outcome value, age, sex, and APOE genotype. Due to high collinearity between </w:t>
+        <w:t xml:space="preserve">We will fit separate </w:t>
+      </w:r>
+      <w:r>
+        <w:rPr>
+          <w:rFonts w:asciiTheme="majorBidi" w:hAnsiTheme="majorBidi" w:cstheme="majorBidi"/>
+        </w:rPr>
+        <w:t xml:space="preserve">multiple </w:t>
+      </w:r>
+      <w:r>
+        <w:rPr>
+          <w:rFonts w:asciiTheme="majorBidi" w:hAnsiTheme="majorBidi" w:cstheme="majorBidi"/>
+        </w:rPr>
+        <w:t xml:space="preserve">linear regression models for each of the six </w:t>
+      </w:r>
+      <w:r>
+        <w:rPr>
+          <w:rFonts w:asciiTheme="majorBidi" w:hAnsiTheme="majorBidi" w:cstheme="majorBidi"/>
+        </w:rPr>
+        <w:t xml:space="preserve">continuous </w:t>
+      </w:r>
+      <w:r>
+        <w:rPr>
+          <w:rFonts w:asciiTheme="majorBidi" w:hAnsiTheme="majorBidi" w:cstheme="majorBidi"/>
+        </w:rPr>
+        <w:t xml:space="preserve">outcomes of interest, the five cognitive measures (listed in Table 3) and cortical thickness. Each model will examine change from baseline to one-year follow-up in the respective outcome, while adjusting for the corresponding baseline outcome value, age, sex, and APOE genotype. </w:t>
+      </w:r>
+      <w:r>
+        <w:rPr>
+          <w:rFonts w:asciiTheme="majorBidi" w:hAnsiTheme="majorBidi" w:cstheme="majorBidi"/>
+        </w:rPr>
+        <w:t xml:space="preserve">Additional potential confounders will be assessed. </w:t>
+      </w:r>
+      <w:r>
+        <w:rPr>
+          <w:rFonts w:asciiTheme="majorBidi" w:hAnsiTheme="majorBidi" w:cstheme="majorBidi"/>
+        </w:rPr>
+        <w:t xml:space="preserve">Due to high collinearity between </w:t>
       </w:r>
       <w:r>
         <w:rPr>
@@ -124,7 +160,37 @@
         <w:rPr>
           <w:rFonts w:asciiTheme="majorBidi" w:hAnsiTheme="majorBidi" w:cstheme="majorBidi"/>
         </w:rPr>
-        <w:t xml:space="preserve">(r = 0.93), cytokine and chemokine levels will be modeled separately to avoid </w:t>
+        <w:t>(r = 0.93), cytokine and chemokine levels</w:t>
+      </w:r>
+      <w:r>
+        <w:rPr>
+          <w:rFonts w:asciiTheme="majorBidi" w:hAnsiTheme="majorBidi" w:cstheme="majorBidi"/>
+        </w:rPr>
+        <w:t xml:space="preserve"> (IL-6, TNF-</w:t>
+      </w:r>
+      <w:r>
+        <w:rPr>
+          <w:rFonts w:asciiTheme="majorBidi" w:hAnsiTheme="majorBidi" w:cstheme="majorBidi"/>
+        </w:rPr>
+        <w:t xml:space="preserve"> </w:t>
+      </w:r>
+      <w:r>
+        <w:rPr>
+          <w:rFonts w:asciiTheme="majorBidi" w:hAnsiTheme="majorBidi" w:cstheme="majorBidi"/>
+        </w:rPr>
+        <w:t>α</w:t>
+      </w:r>
+      <w:r>
+        <w:rPr>
+          <w:rFonts w:asciiTheme="majorBidi" w:hAnsiTheme="majorBidi" w:cstheme="majorBidi"/>
+        </w:rPr>
+        <w:t>, MCP-1, Eotaxin-1)</w:t>
+      </w:r>
+      <w:r>
+        <w:rPr>
+          <w:rFonts w:asciiTheme="majorBidi" w:hAnsiTheme="majorBidi" w:cstheme="majorBidi"/>
+        </w:rPr>
+        <w:t xml:space="preserve"> will be modeled separately to avoid </w:t>
       </w:r>
       <w:r>
         <w:rPr>
@@ -160,7 +226,55 @@
         <w:rPr>
           <w:rFonts w:asciiTheme="majorBidi" w:hAnsiTheme="majorBidi" w:cstheme="majorBidi"/>
         </w:rPr>
-        <w:t>. For 1a, the predictors of interest will be baseline cytokine and chemokine levels. For 1b, the predictors of interest will be the change in cytokine and chemokine levels from baseline to one-year follow-up.</w:t>
+        <w:t>. For</w:t>
+      </w:r>
+      <w:r>
+        <w:rPr>
+          <w:rFonts w:asciiTheme="majorBidi" w:hAnsiTheme="majorBidi" w:cstheme="majorBidi"/>
+        </w:rPr>
+        <w:t xml:space="preserve"> hypothesis</w:t>
+      </w:r>
+      <w:r>
+        <w:rPr>
+          <w:rFonts w:asciiTheme="majorBidi" w:hAnsiTheme="majorBidi" w:cstheme="majorBidi"/>
+        </w:rPr>
+        <w:t xml:space="preserve"> 1a, the predictors of interest will be </w:t>
+      </w:r>
+      <w:r>
+        <w:rPr>
+          <w:rFonts w:asciiTheme="majorBidi" w:hAnsiTheme="majorBidi" w:cstheme="majorBidi"/>
+        </w:rPr>
+        <w:t>the inflammatory markers at baseline</w:t>
+      </w:r>
+      <w:r>
+        <w:rPr>
+          <w:rFonts w:asciiTheme="majorBidi" w:hAnsiTheme="majorBidi" w:cstheme="majorBidi"/>
+        </w:rPr>
+        <w:t xml:space="preserve">. For 1b, the predictors of interest will be the change in </w:t>
+      </w:r>
+      <w:r>
+        <w:rPr>
+          <w:rFonts w:asciiTheme="majorBidi" w:hAnsiTheme="majorBidi" w:cstheme="majorBidi"/>
+        </w:rPr>
+        <w:t>the inflammatory markers</w:t>
+      </w:r>
+      <w:r>
+        <w:rPr>
+          <w:rFonts w:asciiTheme="majorBidi" w:hAnsiTheme="majorBidi" w:cstheme="majorBidi"/>
+        </w:rPr>
+        <w:t xml:space="preserve"> from baseline to one-year follow-up.</w:t>
+      </w:r>
+      <w:r>
+        <w:rPr>
+          <w:rFonts w:asciiTheme="majorBidi" w:hAnsiTheme="majorBidi" w:cstheme="majorBidi"/>
+        </w:rPr>
+        <w:t xml:space="preserve"> </w:t>
+      </w:r>
+      <w:r>
+        <w:rPr>
+          <w:rFonts w:asciiTheme="majorBidi" w:hAnsiTheme="majorBidi" w:cstheme="majorBidi"/>
+        </w:rPr>
+        <w:t>Statistical significance will be evaluated at α = 0.05.</w:t>
       </w:r>
     </w:p>
     <w:p>
@@ -190,13 +304,49 @@
         <w:rPr>
           <w:rFonts w:asciiTheme="majorBidi" w:hAnsiTheme="majorBidi" w:cstheme="majorBidi"/>
         </w:rPr>
-        <w:t>We will fit separate models for each of the six outcomes of interest, the five cognitive measures (listed in Table 3) and cortical thickness. Each</w:t>
-      </w:r>
-      <w:r>
-        <w:rPr>
-          <w:rFonts w:asciiTheme="majorBidi" w:hAnsiTheme="majorBidi" w:cstheme="majorBidi"/>
-        </w:rPr>
-        <w:t xml:space="preserve"> model will examine change from baseline to one-year follow-up in the respective outcome, </w:t>
+        <w:t xml:space="preserve">We will fit separate </w:t>
+      </w:r>
+      <w:r>
+        <w:rPr>
+          <w:rFonts w:asciiTheme="majorBidi" w:hAnsiTheme="majorBidi" w:cstheme="majorBidi"/>
+        </w:rPr>
+        <w:t xml:space="preserve">multiple linear regression </w:t>
+      </w:r>
+      <w:r>
+        <w:rPr>
+          <w:rFonts w:asciiTheme="majorBidi" w:hAnsiTheme="majorBidi" w:cstheme="majorBidi"/>
+        </w:rPr>
+        <w:t xml:space="preserve">models for each of the six </w:t>
+      </w:r>
+      <w:r>
+        <w:rPr>
+          <w:rFonts w:asciiTheme="majorBidi" w:hAnsiTheme="majorBidi" w:cstheme="majorBidi"/>
+        </w:rPr>
+        <w:t xml:space="preserve">continuous </w:t>
+      </w:r>
+      <w:r>
+        <w:rPr>
+          <w:rFonts w:asciiTheme="majorBidi" w:hAnsiTheme="majorBidi" w:cstheme="majorBidi"/>
+        </w:rPr>
+        <w:t xml:space="preserve">outcomes of interest, the five cognitive measures (listed in Table 3) and cortical thickness. </w:t>
+      </w:r>
+      <w:r>
+        <w:rPr>
+          <w:rFonts w:asciiTheme="majorBidi" w:hAnsiTheme="majorBidi" w:cstheme="majorBidi"/>
+        </w:rPr>
+        <w:t>Similar to Aim 1, e</w:t>
+      </w:r>
+      <w:r>
+        <w:rPr>
+          <w:rFonts w:asciiTheme="majorBidi" w:hAnsiTheme="majorBidi" w:cstheme="majorBidi"/>
+        </w:rPr>
+        <w:t>ach</w:t>
+      </w:r>
+      <w:r>
+        <w:rPr>
+          <w:rFonts w:asciiTheme="majorBidi" w:hAnsiTheme="majorBidi" w:cstheme="majorBidi"/>
+        </w:rPr>
+        <w:t xml:space="preserve"> model will examine change from baseline to one-year follow-up in the respective outcome </w:t>
       </w:r>
       <w:r>
         <w:rPr>
@@ -208,7 +358,43 @@
         <w:rPr>
           <w:rFonts w:asciiTheme="majorBidi" w:hAnsiTheme="majorBidi" w:cstheme="majorBidi"/>
         </w:rPr>
-        <w:t>adjusting for the corresponding baseline outcome value, age, sex, APOE genotype, and global SUVR score. Each model will additionally include an interaction term between each inflammatory marker and amyloid status (positive vs. negative), along with the main effects of each.</w:t>
+        <w:t xml:space="preserve">adjusting for the corresponding baseline outcome value, age, sex, </w:t>
+      </w:r>
+      <w:r>
+        <w:rPr>
+          <w:rFonts w:asciiTheme="majorBidi" w:hAnsiTheme="majorBidi" w:cstheme="majorBidi"/>
+        </w:rPr>
+        <w:t xml:space="preserve">and </w:t>
+      </w:r>
+      <w:r>
+        <w:rPr>
+          <w:rFonts w:asciiTheme="majorBidi" w:hAnsiTheme="majorBidi" w:cstheme="majorBidi"/>
+        </w:rPr>
+        <w:t xml:space="preserve">APOE genotype. </w:t>
+      </w:r>
+      <w:r>
+        <w:rPr>
+          <w:rFonts w:asciiTheme="majorBidi" w:hAnsiTheme="majorBidi" w:cstheme="majorBidi"/>
+        </w:rPr>
+        <w:t>Additionally, e</w:t>
+      </w:r>
+      <w:r>
+        <w:rPr>
+          <w:rFonts w:asciiTheme="majorBidi" w:hAnsiTheme="majorBidi" w:cstheme="majorBidi"/>
+        </w:rPr>
+        <w:t>ach model will include an interaction term between each inflammatory marker and amyloid status (positive vs. negative), along with the main effects of each</w:t>
+      </w:r>
+      <w:r>
+        <w:rPr>
+          <w:rFonts w:asciiTheme="majorBidi" w:hAnsiTheme="majorBidi" w:cstheme="majorBidi"/>
+        </w:rPr>
+        <w:t>, while adjusting for SUVR global score</w:t>
+      </w:r>
+      <w:r>
+        <w:rPr>
+          <w:rFonts w:asciiTheme="majorBidi" w:hAnsiTheme="majorBidi" w:cstheme="majorBidi"/>
+        </w:rPr>
+        <w:t>.</w:t>
       </w:r>
       <w:r>
         <w:t xml:space="preserve"> </w:t>
@@ -217,7 +403,20 @@
         <w:rPr>
           <w:rFonts w:asciiTheme="majorBidi" w:hAnsiTheme="majorBidi" w:cstheme="majorBidi"/>
         </w:rPr>
-        <w:t>The primary test of interest in each model is the interaction term between the inflammatory marker and amyloid status, which evaluates whether the association between inflammation and cognitive or cortical change differs by amyloid deposition status.</w:t>
+        <w:t xml:space="preserve">Additional potential confounders will be assessed. </w:t>
+      </w:r>
+      <w:r>
+        <w:rPr>
+          <w:rFonts w:asciiTheme="majorBidi" w:hAnsiTheme="majorBidi" w:cstheme="majorBidi"/>
+        </w:rPr>
+        <w:t xml:space="preserve">The primary test of interest in each model is the interaction term between the inflammatory marker and amyloid </w:t>
+      </w:r>
+      <w:r>
+        <w:rPr>
+          <w:rFonts w:asciiTheme="majorBidi" w:hAnsiTheme="majorBidi" w:cstheme="majorBidi"/>
+        </w:rPr>
+        <w:lastRenderedPageBreak/>
+        <w:t>status, which evaluates whether the association between inflammation and cognitive or cortical change differs by amyloid deposition status.</w:t>
       </w:r>
     </w:p>
     <w:p>
@@ -247,22 +446,579 @@
         <w:rPr>
           <w:rFonts w:asciiTheme="majorBidi" w:hAnsiTheme="majorBidi" w:cstheme="majorBidi"/>
         </w:rPr>
+        <w:t>Power analyses were conducted in R using the powertools package. For Aim 1, power was calculated for a test of a single correlation coefficient using the corr.1samp function, assuming a sample size of 175 and a range of expected effect sizes (0.20 to 0.70) informed by preliminary data</w:t>
+      </w:r>
+      <w:r>
+        <w:rPr>
+          <w:rFonts w:asciiTheme="majorBidi" w:hAnsiTheme="majorBidi" w:cstheme="majorBidi"/>
+        </w:rPr>
+        <w:t xml:space="preserve"> (results displayed in Figure 1)</w:t>
+      </w:r>
+      <w:r>
+        <w:rPr>
+          <w:rFonts w:asciiTheme="majorBidi" w:hAnsiTheme="majorBidi" w:cstheme="majorBidi"/>
+        </w:rPr>
+        <w:t>.</w:t>
+      </w:r>
+      <w:r>
+        <w:rPr>
+          <w:rFonts w:asciiTheme="majorBidi" w:hAnsiTheme="majorBidi" w:cstheme="majorBidi"/>
+        </w:rPr>
+        <w:t xml:space="preserve"> All tests were two-sided and</w:t>
+      </w:r>
+      <w:r>
+        <w:rPr>
+          <w:rFonts w:asciiTheme="majorBidi" w:hAnsiTheme="majorBidi" w:cstheme="majorBidi"/>
+        </w:rPr>
+        <w:t xml:space="preserve"> </w:t>
+      </w:r>
+      <w:r>
+        <w:rPr>
+          <w:rFonts w:asciiTheme="majorBidi" w:hAnsiTheme="majorBidi" w:cstheme="majorBidi"/>
+        </w:rPr>
+        <w:t>t</w:t>
+      </w:r>
+      <w:r>
+        <w:rPr>
+          <w:rFonts w:asciiTheme="majorBidi" w:hAnsiTheme="majorBidi" w:cstheme="majorBidi"/>
+        </w:rPr>
+        <w:t xml:space="preserve">hree alpha levels were examined to account for multiple comparisons: α = 0.05/4 (correcting for the number of markers per outcome), α = 0.05/6 (correcting for the number of outcomes), and α = 0.05/24 (correcting for all models). </w:t>
+      </w:r>
+      <w:r>
+        <w:rPr>
+          <w:rFonts w:asciiTheme="majorBidi" w:hAnsiTheme="majorBidi" w:cstheme="majorBidi"/>
+        </w:rPr>
+        <w:t>Power r</w:t>
+      </w:r>
+      <w:r>
+        <w:rPr>
+          <w:rFonts w:asciiTheme="majorBidi" w:hAnsiTheme="majorBidi" w:cstheme="majorBidi"/>
+        </w:rPr>
+        <w:t xml:space="preserve">esults are summarized below in Table 1. </w:t>
+      </w:r>
+      <w:r>
+        <w:rPr>
+          <w:rFonts w:asciiTheme="majorBidi" w:hAnsiTheme="majorBidi" w:cstheme="majorBidi"/>
+        </w:rPr>
+        <w:t xml:space="preserve">For Aim 2, power was calculated for a test of the difference between two correlation coefficients using the corr.2samp function, reflecting the interaction between each inflammatory marker and amyloid status. </w:t>
+      </w:r>
+      <w:r>
+        <w:rPr>
+          <w:rFonts w:asciiTheme="majorBidi" w:hAnsiTheme="majorBidi" w:cstheme="majorBidi"/>
+        </w:rPr>
+        <w:t xml:space="preserve">All tests were two-sided and the same three significance levels as Aim 1 were applied. Given uncertainty in the expected prevalence of amyloid positivity in this sample, power was evaluated across a range of amyloid positive group sizes (N+ = 25, 56, 88, 120, 150), with the corresponding amyloid negative group sizes (N- = 175 – N+). The two most extreme group sizes did not achieve 80% power within the range of effect sizes examined. The minimum detectable difference in correlations at 80% power for the remaining group size scenarios </w:t>
+      </w:r>
+      <w:r>
+        <w:rPr>
+          <w:rFonts w:asciiTheme="majorBidi" w:hAnsiTheme="majorBidi" w:cstheme="majorBidi"/>
+        </w:rPr>
+        <w:t>is</w:t>
+      </w:r>
+      <w:r>
+        <w:rPr>
+          <w:rFonts w:asciiTheme="majorBidi" w:hAnsiTheme="majorBidi" w:cstheme="majorBidi"/>
+        </w:rPr>
+        <w:t xml:space="preserve"> reported in Table 2.</w:t>
+      </w:r>
+    </w:p>
+    <w:p>
+      <w:pPr>
+        <w:spacing w:after="0" w:line="480" w:lineRule="auto"/>
+        <w:rPr>
+          <w:rFonts w:asciiTheme="majorBidi" w:hAnsiTheme="majorBidi" w:cstheme="majorBidi"/>
+        </w:rPr>
+      </w:pPr>
+    </w:p>
+    <w:p>
+      <w:pPr>
+        <w:spacing w:after="0" w:line="480" w:lineRule="auto"/>
+        <w:rPr>
+          <w:rFonts w:asciiTheme="majorBidi" w:hAnsiTheme="majorBidi" w:cstheme="majorBidi"/>
+          <w:b/>
+          <w:bCs/>
+        </w:rPr>
+      </w:pPr>
+    </w:p>
+    <w:p>
+      <w:pPr>
+        <w:spacing w:after="0" w:line="480" w:lineRule="auto"/>
+        <w:rPr>
+          <w:rFonts w:asciiTheme="majorBidi" w:hAnsiTheme="majorBidi" w:cstheme="majorBidi"/>
+          <w:b/>
+          <w:bCs/>
+        </w:rPr>
+      </w:pPr>
+    </w:p>
+    <w:p>
+      <w:pPr>
+        <w:spacing w:after="0" w:line="480" w:lineRule="auto"/>
+        <w:rPr>
+          <w:rFonts w:asciiTheme="majorBidi" w:hAnsiTheme="majorBidi" w:cstheme="majorBidi"/>
+          <w:b/>
+          <w:bCs/>
+        </w:rPr>
+      </w:pPr>
+    </w:p>
+    <w:p>
+      <w:pPr>
+        <w:spacing w:after="0" w:line="480" w:lineRule="auto"/>
+        <w:rPr>
+          <w:rFonts w:asciiTheme="majorBidi" w:hAnsiTheme="majorBidi" w:cstheme="majorBidi"/>
+        </w:rPr>
+      </w:pPr>
+      <w:r>
+        <w:rPr>
+          <w:rFonts w:asciiTheme="majorBidi" w:hAnsiTheme="majorBidi" w:cstheme="majorBidi"/>
+          <w:b/>
+          <w:bCs/>
+        </w:rPr>
         <w:lastRenderedPageBreak/>
-        <w:t xml:space="preserve">Power analyses were conducted in R using the </w:t>
-      </w:r>
-      <w:proofErr w:type="spellStart"/>
-      <w:r>
-        <w:rPr>
-          <w:rFonts w:asciiTheme="majorBidi" w:hAnsiTheme="majorBidi" w:cstheme="majorBidi"/>
-        </w:rPr>
-        <w:t>powertools</w:t>
-      </w:r>
-      <w:proofErr w:type="spellEnd"/>
-      <w:r>
-        <w:rPr>
-          <w:rFonts w:asciiTheme="majorBidi" w:hAnsiTheme="majorBidi" w:cstheme="majorBidi"/>
-        </w:rPr>
-        <w:t xml:space="preserve"> package. For Aim 1, power was calculated for a test of a single correlation coefficient using the corr.1.samp function, assuming a sample size of N = 175 and a range of expected effect sizes (r = 0.20 to 0.70) informed by preliminary data. Three alpha levels were examined to account for multiple comparisons: α = 0.05/4 (correcting for the number of markers per outcome), α = 0.05/6 (correcting for the number of outcomes), and α = 0.05/24 (correcting for all models). </w:t>
+        <w:t>Figure 1.</w:t>
+      </w:r>
+      <w:r>
+        <w:rPr>
+          <w:rFonts w:asciiTheme="majorBidi" w:hAnsiTheme="majorBidi" w:cstheme="majorBidi"/>
+        </w:rPr>
+        <w:t xml:space="preserve"> </w:t>
+      </w:r>
+      <w:r>
+        <w:rPr>
+          <w:rFonts w:asciiTheme="majorBidi" w:hAnsiTheme="majorBidi" w:cstheme="majorBidi"/>
+        </w:rPr>
+        <w:t xml:space="preserve">Matrix of </w:t>
+      </w:r>
+      <w:r>
+        <w:rPr>
+          <w:rFonts w:asciiTheme="majorBidi" w:hAnsiTheme="majorBidi" w:cstheme="majorBidi"/>
+        </w:rPr>
+        <w:t>Pearson c</w:t>
+      </w:r>
+      <w:r>
+        <w:rPr>
+          <w:rFonts w:asciiTheme="majorBidi" w:hAnsiTheme="majorBidi" w:cstheme="majorBidi"/>
+        </w:rPr>
+        <w:t>orrelations</w:t>
+      </w:r>
+      <w:r>
+        <w:rPr>
+          <w:rFonts w:asciiTheme="majorBidi" w:hAnsiTheme="majorBidi" w:cstheme="majorBidi"/>
+        </w:rPr>
+        <w:t xml:space="preserve"> between two baseline inflammatory markers and changes for two outcomes (lower triangle shown).</w:t>
+      </w:r>
+      <w:r>
+        <w:rPr>
+          <w:rFonts w:asciiTheme="majorBidi" w:hAnsiTheme="majorBidi" w:cstheme="majorBidi"/>
+        </w:rPr>
+        <w:t xml:space="preserve"> </w:t>
+      </w:r>
+      <w:r>
+        <w:rPr>
+          <w:rFonts w:asciiTheme="majorBidi" w:hAnsiTheme="majorBidi" w:cstheme="majorBidi"/>
+        </w:rPr>
+        <w:t>Color intensity reflects the strength of the correlation, with red indicating negative associations and blue indicating positive associations.</w:t>
+      </w:r>
+    </w:p>
+    <w:p>
+      <w:pPr>
+        <w:jc w:val="center"/>
+        <w:rPr>
+          <w:rFonts w:asciiTheme="majorBidi" w:hAnsiTheme="majorBidi" w:cstheme="majorBidi"/>
+        </w:rPr>
+      </w:pPr>
+      <w:r>
+        <w:rPr>
+          <w:rFonts w:asciiTheme="majorBidi" w:hAnsiTheme="majorBidi" w:cstheme="majorBidi"/>
+          <w:noProof/>
+        </w:rPr>
+        <w:drawing>
+          <wp:inline distT="0" distB="0" distL="0" distR="0" wp14:anchorId="04D96072" wp14:editId="5AC414E9">
+            <wp:extent cx="3673612" cy="2734407"/>
+            <wp:effectExtent l="0" t="0" r="0" b="0"/>
+            <wp:docPr id="358992127" name="Picture 3"/>
+            <wp:cNvGraphicFramePr>
+              <a:graphicFrameLocks xmlns:a="http://schemas.openxmlformats.org/drawingml/2006/main" noChangeAspect="1"/>
+            </wp:cNvGraphicFramePr>
+            <a:graphic xmlns:a="http://schemas.openxmlformats.org/drawingml/2006/main">
+              <a:graphicData uri="http://schemas.openxmlformats.org/drawingml/2006/picture">
+                <pic:pic xmlns:pic="http://schemas.openxmlformats.org/drawingml/2006/picture">
+                  <pic:nvPicPr>
+                    <pic:cNvPr id="358992127" name="Picture 358992127"/>
+                    <pic:cNvPicPr/>
+                  </pic:nvPicPr>
+                  <pic:blipFill>
+                    <a:blip r:embed="rId6" cstate="print">
+                      <a:extLst>
+                        <a:ext uri="{28A0092B-C50C-407E-A947-70E740481C1C}">
+                          <a14:useLocalDpi xmlns:a14="http://schemas.microsoft.com/office/drawing/2010/main" val="0"/>
+                        </a:ext>
+                      </a:extLst>
+                    </a:blip>
+                    <a:stretch>
+                      <a:fillRect/>
+                    </a:stretch>
+                  </pic:blipFill>
+                  <pic:spPr>
+                    <a:xfrm>
+                      <a:off x="0" y="0"/>
+                      <a:ext cx="3711184" cy="2762374"/>
+                    </a:xfrm>
+                    <a:prstGeom prst="rect">
+                      <a:avLst/>
+                    </a:prstGeom>
+                  </pic:spPr>
+                </pic:pic>
+              </a:graphicData>
+            </a:graphic>
+          </wp:inline>
+        </w:drawing>
+      </w:r>
+    </w:p>
+    <w:p>
+      <w:pPr>
+        <w:rPr>
+          <w:rFonts w:asciiTheme="majorBidi" w:hAnsiTheme="majorBidi" w:cstheme="majorBidi"/>
+        </w:rPr>
+      </w:pPr>
+    </w:p>
+    <w:p>
+      <w:pPr>
+        <w:spacing w:line="480" w:lineRule="auto"/>
+        <w:rPr>
+          <w:rFonts w:asciiTheme="majorBidi" w:hAnsiTheme="majorBidi" w:cstheme="majorBidi"/>
+          <w:b/>
+          <w:bCs/>
+        </w:rPr>
+      </w:pPr>
+    </w:p>
+    <w:p>
+      <w:pPr>
+        <w:spacing w:line="480" w:lineRule="auto"/>
+        <w:rPr>
+          <w:rFonts w:asciiTheme="majorBidi" w:hAnsiTheme="majorBidi" w:cstheme="majorBidi"/>
+          <w:b/>
+          <w:bCs/>
+        </w:rPr>
+      </w:pPr>
+    </w:p>
+    <w:p>
+      <w:pPr>
+        <w:spacing w:line="480" w:lineRule="auto"/>
+        <w:rPr>
+          <w:rFonts w:asciiTheme="majorBidi" w:hAnsiTheme="majorBidi" w:cstheme="majorBidi"/>
+          <w:b/>
+          <w:bCs/>
+        </w:rPr>
+      </w:pPr>
+    </w:p>
+    <w:p>
+      <w:pPr>
+        <w:spacing w:line="480" w:lineRule="auto"/>
+        <w:rPr>
+          <w:rFonts w:asciiTheme="majorBidi" w:hAnsiTheme="majorBidi" w:cstheme="majorBidi"/>
+          <w:b/>
+          <w:bCs/>
+        </w:rPr>
+      </w:pPr>
+    </w:p>
+    <w:p>
+      <w:pPr>
+        <w:spacing w:line="480" w:lineRule="auto"/>
+        <w:rPr>
+          <w:rFonts w:asciiTheme="majorBidi" w:hAnsiTheme="majorBidi" w:cstheme="majorBidi"/>
+          <w:b/>
+          <w:bCs/>
+        </w:rPr>
+      </w:pPr>
+    </w:p>
+    <w:p>
+      <w:pPr>
+        <w:spacing w:line="480" w:lineRule="auto"/>
+        <w:rPr>
+          <w:rFonts w:asciiTheme="majorBidi" w:hAnsiTheme="majorBidi" w:cstheme="majorBidi"/>
+          <w:b/>
+          <w:bCs/>
+        </w:rPr>
+      </w:pPr>
+    </w:p>
+    <w:p>
+      <w:pPr>
+        <w:spacing w:line="480" w:lineRule="auto"/>
+        <w:rPr>
+          <w:rFonts w:asciiTheme="majorBidi" w:hAnsiTheme="majorBidi" w:cstheme="majorBidi"/>
+          <w:b/>
+          <w:bCs/>
+        </w:rPr>
+      </w:pPr>
+    </w:p>
+    <w:p>
+      <w:pPr>
+        <w:spacing w:line="480" w:lineRule="auto"/>
+        <w:rPr>
+          <w:rFonts w:asciiTheme="majorBidi" w:hAnsiTheme="majorBidi" w:cstheme="majorBidi"/>
+        </w:rPr>
+      </w:pPr>
+      <w:r>
+        <w:rPr>
+          <w:rFonts w:asciiTheme="majorBidi" w:hAnsiTheme="majorBidi" w:cstheme="majorBidi"/>
+          <w:b/>
+          <w:bCs/>
+        </w:rPr>
+        <w:lastRenderedPageBreak/>
+        <w:t>Table 1.</w:t>
+      </w:r>
+      <w:r>
+        <w:rPr>
+          <w:rFonts w:asciiTheme="majorBidi" w:hAnsiTheme="majorBidi" w:cstheme="majorBidi"/>
+        </w:rPr>
+        <w:t xml:space="preserve"> </w:t>
+      </w:r>
+      <w:r>
+        <w:rPr>
+          <w:rFonts w:asciiTheme="majorBidi" w:hAnsiTheme="majorBidi" w:cstheme="majorBidi"/>
+        </w:rPr>
+        <w:t>Statistical power for Aim 1 by effect size and significance level (N = 175, two-sided test). Significance levels reflect corrections for the number of markers per outcome (α = 0.05/4), number of outcomes (α = 0.05/6), and all models combined (α = 0.05/24)</w:t>
+      </w:r>
+      <w:r>
+        <w:rPr>
+          <w:rFonts w:asciiTheme="majorBidi" w:hAnsiTheme="majorBidi" w:cstheme="majorBidi"/>
+        </w:rPr>
+        <w:t>.</w:t>
+      </w:r>
+    </w:p>
+    <w:p>
+      <w:pPr>
+        <w:jc w:val="center"/>
+        <w:rPr>
+          <w:rFonts w:asciiTheme="majorBidi" w:hAnsiTheme="majorBidi" w:cstheme="majorBidi"/>
+        </w:rPr>
+      </w:pPr>
+      <w:r>
+        <w:rPr>
+          <w:rFonts w:asciiTheme="majorBidi" w:hAnsiTheme="majorBidi" w:cstheme="majorBidi"/>
+          <w:b/>
+          <w:bCs/>
+          <w:noProof/>
+        </w:rPr>
+        <w:drawing>
+          <wp:inline distT="0" distB="0" distL="0" distR="0" wp14:anchorId="2C98AF43" wp14:editId="4A2A7B2C">
+            <wp:extent cx="4106008" cy="3777439"/>
+            <wp:effectExtent l="0" t="0" r="0" b="0"/>
+            <wp:docPr id="1692052849" name="Picture 4"/>
+            <wp:cNvGraphicFramePr>
+              <a:graphicFrameLocks xmlns:a="http://schemas.openxmlformats.org/drawingml/2006/main" noChangeAspect="1"/>
+            </wp:cNvGraphicFramePr>
+            <a:graphic xmlns:a="http://schemas.openxmlformats.org/drawingml/2006/main">
+              <a:graphicData uri="http://schemas.openxmlformats.org/drawingml/2006/picture">
+                <pic:pic xmlns:pic="http://schemas.openxmlformats.org/drawingml/2006/picture">
+                  <pic:nvPicPr>
+                    <pic:cNvPr id="1692052849" name="Picture 1692052849"/>
+                    <pic:cNvPicPr/>
+                  </pic:nvPicPr>
+                  <pic:blipFill>
+                    <a:blip r:embed="rId7" cstate="print">
+                      <a:extLst>
+                        <a:ext uri="{28A0092B-C50C-407E-A947-70E740481C1C}">
+                          <a14:useLocalDpi xmlns:a14="http://schemas.microsoft.com/office/drawing/2010/main" val="0"/>
+                        </a:ext>
+                      </a:extLst>
+                    </a:blip>
+                    <a:stretch>
+                      <a:fillRect/>
+                    </a:stretch>
+                  </pic:blipFill>
+                  <pic:spPr>
+                    <a:xfrm>
+                      <a:off x="0" y="0"/>
+                      <a:ext cx="4138723" cy="3807536"/>
+                    </a:xfrm>
+                    <a:prstGeom prst="rect">
+                      <a:avLst/>
+                    </a:prstGeom>
+                  </pic:spPr>
+                </pic:pic>
+              </a:graphicData>
+            </a:graphic>
+          </wp:inline>
+        </w:drawing>
+      </w:r>
+    </w:p>
+    <w:p>
+      <w:pPr>
+        <w:rPr>
+          <w:rFonts w:asciiTheme="majorBidi" w:hAnsiTheme="majorBidi" w:cstheme="majorBidi"/>
+        </w:rPr>
+      </w:pPr>
+    </w:p>
+    <w:p>
+      <w:pPr>
+        <w:rPr>
+          <w:rFonts w:asciiTheme="majorBidi" w:hAnsiTheme="majorBidi" w:cstheme="majorBidi"/>
+        </w:rPr>
+      </w:pPr>
+    </w:p>
+    <w:p>
+      <w:pPr>
+        <w:rPr>
+          <w:rFonts w:asciiTheme="majorBidi" w:hAnsiTheme="majorBidi" w:cstheme="majorBidi"/>
+        </w:rPr>
+      </w:pPr>
+    </w:p>
+    <w:p>
+      <w:pPr>
+        <w:rPr>
+          <w:rFonts w:asciiTheme="majorBidi" w:hAnsiTheme="majorBidi" w:cstheme="majorBidi"/>
+        </w:rPr>
+      </w:pPr>
+    </w:p>
+    <w:p>
+      <w:pPr>
+        <w:rPr>
+          <w:rFonts w:asciiTheme="majorBidi" w:hAnsiTheme="majorBidi" w:cstheme="majorBidi"/>
+        </w:rPr>
+      </w:pPr>
+    </w:p>
+    <w:p>
+      <w:pPr>
+        <w:rPr>
+          <w:rFonts w:asciiTheme="majorBidi" w:hAnsiTheme="majorBidi" w:cstheme="majorBidi"/>
+        </w:rPr>
+      </w:pPr>
+    </w:p>
+    <w:p>
+      <w:pPr>
+        <w:rPr>
+          <w:rFonts w:asciiTheme="majorBidi" w:hAnsiTheme="majorBidi" w:cstheme="majorBidi"/>
+        </w:rPr>
+      </w:pPr>
+    </w:p>
+    <w:p>
+      <w:pPr>
+        <w:rPr>
+          <w:rFonts w:asciiTheme="majorBidi" w:hAnsiTheme="majorBidi" w:cstheme="majorBidi"/>
+        </w:rPr>
+      </w:pPr>
+    </w:p>
+    <w:p>
+      <w:pPr>
+        <w:rPr>
+          <w:rFonts w:asciiTheme="majorBidi" w:hAnsiTheme="majorBidi" w:cstheme="majorBidi"/>
+        </w:rPr>
+      </w:pPr>
+    </w:p>
+    <w:p>
+      <w:pPr>
+        <w:rPr>
+          <w:rFonts w:asciiTheme="majorBidi" w:hAnsiTheme="majorBidi" w:cstheme="majorBidi"/>
+        </w:rPr>
+      </w:pPr>
+    </w:p>
+    <w:p>
+      <w:pPr>
+        <w:spacing w:line="480" w:lineRule="auto"/>
+        <w:rPr>
+          <w:rFonts w:asciiTheme="majorBidi" w:hAnsiTheme="majorBidi" w:cstheme="majorBidi"/>
+        </w:rPr>
+      </w:pPr>
+      <w:r>
+        <w:rPr>
+          <w:rFonts w:asciiTheme="majorBidi" w:hAnsiTheme="majorBidi" w:cstheme="majorBidi"/>
+          <w:b/>
+          <w:bCs/>
+        </w:rPr>
+        <w:lastRenderedPageBreak/>
+        <w:t>Table 2.</w:t>
+      </w:r>
+      <w:r>
+        <w:rPr>
+          <w:rFonts w:asciiTheme="majorBidi" w:hAnsiTheme="majorBidi" w:cstheme="majorBidi"/>
+        </w:rPr>
+        <w:t xml:space="preserve"> </w:t>
+      </w:r>
+      <w:r>
+        <w:rPr>
+          <w:rFonts w:asciiTheme="majorBidi" w:hAnsiTheme="majorBidi" w:cstheme="majorBidi"/>
+        </w:rPr>
+        <w:t>Minimum detectable difference in correlations at 80% power for Aim 2 by amyloid group size and significance level (N = 175, two-sided test). Results are presented for the three most balanced amyloid group size scenarios (N+ = 56, 88, and 120); the two most extreme group sizes (N+ = 25 and N+ = 150) did not achieve 80% power within the range of effect sizes examined</w:t>
+      </w:r>
+      <w:r>
+        <w:rPr>
+          <w:rFonts w:asciiTheme="majorBidi" w:hAnsiTheme="majorBidi" w:cstheme="majorBidi"/>
+        </w:rPr>
+        <w:t xml:space="preserve">. </w:t>
+      </w:r>
+      <w:r>
+        <w:rPr>
+          <w:rFonts w:asciiTheme="majorBidi" w:hAnsiTheme="majorBidi" w:cstheme="majorBidi"/>
+        </w:rPr>
+        <w:t>Significance levels reflect corrections for the number of markers per outcome (α = 0.05/4), number of outcomes (α = 0.05/6), and all models combined (α = 0.05/24).</w:t>
+      </w:r>
+    </w:p>
+    <w:p>
+      <w:pPr>
+        <w:jc w:val="center"/>
+        <w:rPr>
+          <w:rFonts w:asciiTheme="majorBidi" w:hAnsiTheme="majorBidi" w:cstheme="majorBidi"/>
+        </w:rPr>
+      </w:pPr>
+      <w:r>
+        <w:rPr>
+          <w:rFonts w:asciiTheme="majorBidi" w:hAnsiTheme="majorBidi" w:cstheme="majorBidi"/>
+          <w:noProof/>
+        </w:rPr>
+        <w:drawing>
+          <wp:inline distT="0" distB="0" distL="0" distR="0" wp14:anchorId="3A67854D" wp14:editId="72DF4D89">
+            <wp:extent cx="3824654" cy="3445866"/>
+            <wp:effectExtent l="0" t="0" r="0" b="0"/>
+            <wp:docPr id="1441451717" name="Picture 5"/>
+            <wp:cNvGraphicFramePr>
+              <a:graphicFrameLocks xmlns:a="http://schemas.openxmlformats.org/drawingml/2006/main" noChangeAspect="1"/>
+            </wp:cNvGraphicFramePr>
+            <a:graphic xmlns:a="http://schemas.openxmlformats.org/drawingml/2006/main">
+              <a:graphicData uri="http://schemas.openxmlformats.org/drawingml/2006/picture">
+                <pic:pic xmlns:pic="http://schemas.openxmlformats.org/drawingml/2006/picture">
+                  <pic:nvPicPr>
+                    <pic:cNvPr id="1441451717" name="Picture 1441451717"/>
+                    <pic:cNvPicPr/>
+                  </pic:nvPicPr>
+                  <pic:blipFill>
+                    <a:blip r:embed="rId8" cstate="print">
+                      <a:extLst>
+                        <a:ext uri="{28A0092B-C50C-407E-A947-70E740481C1C}">
+                          <a14:useLocalDpi xmlns:a14="http://schemas.microsoft.com/office/drawing/2010/main" val="0"/>
+                        </a:ext>
+                      </a:extLst>
+                    </a:blip>
+                    <a:stretch>
+                      <a:fillRect/>
+                    </a:stretch>
+                  </pic:blipFill>
+                  <pic:spPr>
+                    <a:xfrm>
+                      <a:off x="0" y="0"/>
+                      <a:ext cx="3865162" cy="3482362"/>
+                    </a:xfrm>
+                    <a:prstGeom prst="rect">
+                      <a:avLst/>
+                    </a:prstGeom>
+                  </pic:spPr>
+                </pic:pic>
+              </a:graphicData>
+            </a:graphic>
+          </wp:inline>
+        </w:drawing>
+      </w:r>
+    </w:p>
+    <w:p>
+      <w:pPr>
+        <w:rPr>
+          <w:rFonts w:asciiTheme="majorBidi" w:hAnsiTheme="majorBidi" w:cstheme="majorBidi"/>
+        </w:rPr>
+      </w:pPr>
+      <w:r>
+        <w:rPr>
+          <w:rFonts w:asciiTheme="majorBidi" w:hAnsiTheme="majorBidi" w:cstheme="majorBidi"/>
+        </w:rPr>
+        <w:br w:type="page"/>
       </w:r>
     </w:p>
     <w:p>
@@ -272,27 +1028,151 @@
           <w:rFonts w:asciiTheme="majorBidi" w:hAnsiTheme="majorBidi" w:cstheme="majorBidi"/>
         </w:rPr>
       </w:pPr>
+      <w:r>
+        <w:rPr>
+          <w:rFonts w:asciiTheme="majorBidi" w:hAnsiTheme="majorBidi" w:cstheme="majorBidi"/>
+          <w:b/>
+          <w:bCs/>
+        </w:rPr>
+        <w:lastRenderedPageBreak/>
+        <w:t>Appendix</w:t>
+      </w:r>
     </w:p>
     <w:p>
       <w:pPr>
         <w:spacing w:after="0" w:line="480" w:lineRule="auto"/>
         <w:rPr>
-          <w:rFonts w:asciiTheme="majorBidi" w:hAnsiTheme="majorBidi" w:cstheme="majorBidi"/>
-        </w:rPr>
-      </w:pPr>
+          <w:rFonts w:ascii="Times New Roman" w:hAnsi="Times New Roman" w:cs="Times New Roman"/>
+          <w:b/>
+          <w:bCs/>
+        </w:rPr>
+      </w:pPr>
+      <w:r>
+        <w:rPr>
+          <w:rFonts w:ascii="Times New Roman" w:hAnsi="Times New Roman" w:cs="Times New Roman"/>
+          <w:b/>
+          <w:bCs/>
+        </w:rPr>
+        <w:t>Reproducible Research</w:t>
+      </w:r>
     </w:p>
     <w:p>
       <w:pPr>
         <w:spacing w:after="0" w:line="480" w:lineRule="auto"/>
         <w:rPr>
-          <w:rFonts w:asciiTheme="majorBidi" w:hAnsiTheme="majorBidi" w:cstheme="majorBidi"/>
-        </w:rPr>
-      </w:pPr>
-      <w:r>
-        <w:rPr>
-          <w:rFonts w:asciiTheme="majorBidi" w:hAnsiTheme="majorBidi" w:cstheme="majorBidi"/>
-        </w:rPr>
-        <w:t xml:space="preserve">For Aim 2, power was calculated for a test of the difference between two correlation coefficients using the corr.2samp function, reflecting the interaction between each inflammatory marker and amyloid status. </w:t>
+          <w:rFonts w:ascii="Times New Roman" w:hAnsi="Times New Roman" w:cs="Times New Roman"/>
+        </w:rPr>
+      </w:pPr>
+      <w:r>
+        <w:rPr>
+          <w:rFonts w:ascii="Times New Roman" w:hAnsi="Times New Roman" w:cs="Times New Roman"/>
+        </w:rPr>
+        <w:t xml:space="preserve">All data files and analysis code relevant to this project and final report are available at: </w:t>
+      </w:r>
+      <w:hyperlink r:id="rId9" w:history="1">
+        <w:r>
+          <w:rPr>
+            <w:rStyle w:val="Hyperlink"/>
+            <w:rFonts w:ascii="Times New Roman" w:hAnsi="Times New Roman" w:cs="Times New Roman"/>
+          </w:rPr>
+          <w:t>https://github.com/mmschina/BIOS6624</w:t>
+        </w:r>
+      </w:hyperlink>
+      <w:r>
+        <w:rPr>
+          <w:rFonts w:ascii="Times New Roman" w:hAnsi="Times New Roman" w:cs="Times New Roman"/>
+        </w:rPr>
+        <w:t>. All code can be found within the folder titled Project</w:t>
+      </w:r>
+      <w:r>
+        <w:rPr>
+          <w:rFonts w:ascii="Times New Roman" w:hAnsi="Times New Roman" w:cs="Times New Roman"/>
+        </w:rPr>
+        <w:t>2</w:t>
+      </w:r>
+      <w:r>
+        <w:rPr>
+          <w:rFonts w:ascii="Times New Roman" w:hAnsi="Times New Roman" w:cs="Times New Roman"/>
+        </w:rPr>
+        <w:t xml:space="preserve">/Code/. The </w:t>
+      </w:r>
+      <w:r>
+        <w:rPr>
+          <w:rFonts w:ascii="Times New Roman" w:hAnsi="Times New Roman" w:cs="Times New Roman"/>
+        </w:rPr>
+        <w:t>preliminary</w:t>
+      </w:r>
+      <w:r>
+        <w:rPr>
+          <w:rFonts w:ascii="Times New Roman" w:hAnsi="Times New Roman" w:cs="Times New Roman"/>
+        </w:rPr>
+        <w:t xml:space="preserve"> dataset can be found under Project</w:t>
+      </w:r>
+      <w:r>
+        <w:rPr>
+          <w:rFonts w:ascii="Times New Roman" w:hAnsi="Times New Roman" w:cs="Times New Roman"/>
+        </w:rPr>
+        <w:t>2</w:t>
+      </w:r>
+      <w:r>
+        <w:rPr>
+          <w:rFonts w:ascii="Times New Roman" w:hAnsi="Times New Roman" w:cs="Times New Roman"/>
+        </w:rPr>
+        <w:t>/</w:t>
+      </w:r>
+      <w:r>
+        <w:rPr>
+          <w:rFonts w:ascii="Times New Roman" w:hAnsi="Times New Roman" w:cs="Times New Roman"/>
+        </w:rPr>
+        <w:t>Data/</w:t>
+      </w:r>
+      <w:r>
+        <w:rPr>
+          <w:rFonts w:ascii="Times New Roman" w:hAnsi="Times New Roman" w:cs="Times New Roman"/>
+        </w:rPr>
+        <w:t>PrelimData</w:t>
+      </w:r>
+      <w:r>
+        <w:rPr>
+          <w:rFonts w:ascii="Times New Roman" w:hAnsi="Times New Roman" w:cs="Times New Roman"/>
+        </w:rPr>
+        <w:t>.csv</w:t>
+      </w:r>
+      <w:r>
+        <w:rPr>
+          <w:rFonts w:ascii="Times New Roman" w:hAnsi="Times New Roman" w:cs="Times New Roman"/>
+        </w:rPr>
+        <w:t xml:space="preserve"> on the local drive, specifically: </w:t>
+      </w:r>
+      <w:r>
+        <w:rPr>
+          <w:rFonts w:ascii="Times New Roman" w:hAnsi="Times New Roman" w:cs="Times New Roman"/>
+        </w:rPr>
+        <w:t xml:space="preserve">/Users/Madelynn/Documents/Spring 2026 Courses/Advanced Statistical Methods - BIOS 6624/BIOS6624/Project </w:t>
+      </w:r>
+      <w:r>
+        <w:rPr>
+          <w:rFonts w:ascii="Times New Roman" w:hAnsi="Times New Roman" w:cs="Times New Roman"/>
+        </w:rPr>
+        <w:t>2</w:t>
+      </w:r>
+      <w:r>
+        <w:rPr>
+          <w:rFonts w:ascii="Times New Roman" w:hAnsi="Times New Roman" w:cs="Times New Roman"/>
+        </w:rPr>
+        <w:t>/Data/</w:t>
+      </w:r>
+      <w:r>
+        <w:rPr>
+          <w:rFonts w:ascii="Times New Roman" w:hAnsi="Times New Roman" w:cs="Times New Roman"/>
+        </w:rPr>
+        <w:t>PrelimData</w:t>
+      </w:r>
+      <w:r>
+        <w:rPr>
+          <w:rFonts w:ascii="Times New Roman" w:hAnsi="Times New Roman" w:cs="Times New Roman"/>
+        </w:rPr>
+        <w:t>.csv</w:t>
       </w:r>
     </w:p>
     <w:p>
@@ -311,50 +1191,8 @@
         </w:rPr>
       </w:pPr>
     </w:p>
-    <w:p>
-      <w:pPr>
-        <w:spacing w:after="0" w:line="480" w:lineRule="auto"/>
-        <w:rPr>
-          <w:rFonts w:asciiTheme="majorBidi" w:hAnsiTheme="majorBidi" w:cstheme="majorBidi"/>
-        </w:rPr>
-      </w:pPr>
-      <w:r>
-        <w:rPr>
-          <w:rFonts w:asciiTheme="majorBidi" w:hAnsiTheme="majorBidi" w:cstheme="majorBidi"/>
-        </w:rPr>
-        <w:t>Statistical significance will be evaluated at α = 0.05. Given the number of outcomes and markers examined across both aims, results will be interpreted in the context of effect sizes and 95% confidence intervals in addition to p-values, and findings should be considered exploratory pending replication.</w:t>
-      </w:r>
-      <w:r>
-        <w:rPr>
-          <w:rFonts w:asciiTheme="majorBidi" w:hAnsiTheme="majorBidi" w:cstheme="majorBidi"/>
-        </w:rPr>
-        <w:t xml:space="preserve"> </w:t>
-      </w:r>
-      <w:r>
-        <w:rPr>
-          <w:rFonts w:asciiTheme="majorBidi" w:hAnsiTheme="majorBidi" w:cstheme="majorBidi"/>
-        </w:rPr>
-        <w:t>All analyses will be conducted in R.</w:t>
-      </w:r>
-    </w:p>
-    <w:p>
-      <w:pPr>
-        <w:spacing w:after="0" w:line="480" w:lineRule="auto"/>
-        <w:rPr>
-          <w:rFonts w:asciiTheme="majorBidi" w:hAnsiTheme="majorBidi" w:cstheme="majorBidi"/>
-        </w:rPr>
-      </w:pPr>
-    </w:p>
-    <w:p>
-      <w:pPr>
-        <w:spacing w:after="0" w:line="480" w:lineRule="auto"/>
-        <w:rPr>
-          <w:rFonts w:asciiTheme="majorBidi" w:hAnsiTheme="majorBidi" w:cstheme="majorBidi"/>
-        </w:rPr>
-      </w:pPr>
-    </w:p>
     <w:sectPr>
-      <w:headerReference w:type="default" r:id="rId6"/>
+      <w:headerReference w:type="default" r:id="rId10"/>
       <w:pgSz w:w="12240" w:h="15840"/>
       <w:pgMar w:top="1440" w:right="1440" w:bottom="1440" w:left="1440" w:header="720" w:footer="720" w:gutter="0"/>
       <w:cols w:space="720"/>
@@ -1432,6 +2270,17 @@
       <w:lang w:eastAsia="en-US"/>
     </w:rPr>
   </w:style>
+  <w:style w:type="character" w:styleId="Hyperlink">
+    <w:name w:val="Hyperlink"/>
+    <w:basedOn w:val="DefaultParagraphFont"/>
+    <w:uiPriority w:val="99"/>
+    <w:unhideWhenUsed/>
+    <w:rsid w:val="00E61051"/>
+    <w:rPr>
+      <w:color w:val="467886" w:themeColor="hyperlink"/>
+      <w:u w:val="single"/>
+    </w:rPr>
+  </w:style>
 </w:styles>
 </file>
 

</xml_diff>

<commit_message>
Project 2 Final Report - added interpretations/conclusions to report and finished presentation slides
</commit_message>
<xml_diff>
--- a/Project 2/Reports/Project 2 - Final Report.docx
+++ b/Project 2/Reports/Project 2 - Final Report.docx
@@ -12,7 +12,6 @@
           <w:bCs/>
           <w:sz w:val="28"/>
           <w:szCs w:val="28"/>
-          <w:lang w:val="pt-BR"/>
         </w:rPr>
       </w:pPr>
       <w:r>
@@ -22,47 +21,40 @@
           <w:bCs/>
           <w:sz w:val="28"/>
           <w:szCs w:val="28"/>
-          <w:lang w:val="pt-BR"/>
-        </w:rPr>
-        <w:t>Project</w:t>
-      </w:r>
+        </w:rPr>
+        <w:t>Project 2 Final Report – BIOS 6624</w:t>
+      </w:r>
+    </w:p>
+    <w:p>
+      <w:pPr>
+        <w:spacing w:after="0" w:line="480" w:lineRule="auto"/>
+        <w:rPr>
+          <w:rFonts w:asciiTheme="majorBidi" w:hAnsiTheme="majorBidi" w:cstheme="majorBidi"/>
+        </w:rPr>
+      </w:pPr>
       <w:r>
         <w:rPr>
           <w:rFonts w:asciiTheme="majorBidi" w:hAnsiTheme="majorBidi" w:cstheme="majorBidi"/>
           <w:b/>
           <w:bCs/>
-          <w:sz w:val="28"/>
-          <w:szCs w:val="28"/>
-          <w:lang w:val="pt-BR"/>
-        </w:rPr>
-        <w:t xml:space="preserve"> 2</w:t>
+        </w:rPr>
+        <w:t>C.5.e</w:t>
       </w:r>
       <w:r>
         <w:rPr>
           <w:rFonts w:asciiTheme="majorBidi" w:hAnsiTheme="majorBidi" w:cstheme="majorBidi"/>
           <w:b/>
           <w:bCs/>
-          <w:sz w:val="28"/>
-          <w:szCs w:val="28"/>
-          <w:lang w:val="pt-BR"/>
-        </w:rPr>
-        <w:t xml:space="preserve"> Final Report – BIOS 6624</w:t>
-      </w:r>
-    </w:p>
-    <w:p>
-      <w:pPr>
-        <w:spacing w:after="0" w:line="480" w:lineRule="auto"/>
-        <w:rPr>
-          <w:rFonts w:asciiTheme="majorBidi" w:hAnsiTheme="majorBidi" w:cstheme="majorBidi"/>
-        </w:rPr>
-      </w:pPr>
+        </w:rPr>
+        <w:t>.</w:t>
+      </w:r>
       <w:r>
         <w:rPr>
           <w:rFonts w:asciiTheme="majorBidi" w:hAnsiTheme="majorBidi" w:cstheme="majorBidi"/>
           <w:b/>
           <w:bCs/>
         </w:rPr>
-        <w:t>C.5.e</w:t>
+        <w:t xml:space="preserve"> Aim 1 Analytical Plan</w:t>
       </w:r>
       <w:r>
         <w:rPr>
@@ -70,23 +62,353 @@
           <w:b/>
           <w:bCs/>
         </w:rPr>
-        <w:t>.</w:t>
-      </w:r>
+        <w:t>:</w:t>
+      </w:r>
+    </w:p>
+    <w:p>
+      <w:pPr>
+        <w:spacing w:after="0" w:line="480" w:lineRule="auto"/>
+        <w:rPr>
+          <w:rFonts w:asciiTheme="majorBidi" w:hAnsiTheme="majorBidi" w:cstheme="majorBidi"/>
+        </w:rPr>
+      </w:pPr>
+      <w:r>
+        <w:rPr>
+          <w:rFonts w:asciiTheme="majorBidi" w:hAnsiTheme="majorBidi" w:cstheme="majorBidi"/>
+        </w:rPr>
+        <w:t xml:space="preserve">We will fit separate </w:t>
+      </w:r>
+      <w:r>
+        <w:rPr>
+          <w:rFonts w:asciiTheme="majorBidi" w:hAnsiTheme="majorBidi" w:cstheme="majorBidi"/>
+        </w:rPr>
+        <w:t xml:space="preserve">multiple </w:t>
+      </w:r>
+      <w:r>
+        <w:rPr>
+          <w:rFonts w:asciiTheme="majorBidi" w:hAnsiTheme="majorBidi" w:cstheme="majorBidi"/>
+        </w:rPr>
+        <w:t xml:space="preserve">linear regression models for each of the six </w:t>
+      </w:r>
+      <w:r>
+        <w:rPr>
+          <w:rFonts w:asciiTheme="majorBidi" w:hAnsiTheme="majorBidi" w:cstheme="majorBidi"/>
+        </w:rPr>
+        <w:t xml:space="preserve">continuous </w:t>
+      </w:r>
+      <w:r>
+        <w:rPr>
+          <w:rFonts w:asciiTheme="majorBidi" w:hAnsiTheme="majorBidi" w:cstheme="majorBidi"/>
+        </w:rPr>
+        <w:t xml:space="preserve">outcomes of interest, the five cognitive measures (listed in Table 3) and cortical thickness. Each model will examine change from baseline to one-year follow-up in the respective outcome, while adjusting for the corresponding baseline outcome value, age, sex, and APOE genotype. </w:t>
+      </w:r>
+      <w:r>
+        <w:rPr>
+          <w:rFonts w:asciiTheme="majorBidi" w:hAnsiTheme="majorBidi" w:cstheme="majorBidi"/>
+        </w:rPr>
+        <w:t xml:space="preserve">Additional potential confounders will be assessed. </w:t>
+      </w:r>
+      <w:r>
+        <w:rPr>
+          <w:rFonts w:asciiTheme="majorBidi" w:hAnsiTheme="majorBidi" w:cstheme="majorBidi"/>
+        </w:rPr>
+        <w:t xml:space="preserve">Due to high collinearity between </w:t>
+      </w:r>
+      <w:r>
+        <w:rPr>
+          <w:rFonts w:asciiTheme="majorBidi" w:hAnsiTheme="majorBidi" w:cstheme="majorBidi"/>
+        </w:rPr>
+        <w:t>two of the</w:t>
+      </w:r>
+      <w:r>
+        <w:rPr>
+          <w:rFonts w:asciiTheme="majorBidi" w:hAnsiTheme="majorBidi" w:cstheme="majorBidi"/>
+        </w:rPr>
+        <w:t xml:space="preserve"> inflammation markers of interest </w:t>
+      </w:r>
+      <w:r>
+        <w:rPr>
+          <w:rFonts w:asciiTheme="majorBidi" w:hAnsiTheme="majorBidi" w:cstheme="majorBidi"/>
+        </w:rPr>
+        <w:t xml:space="preserve">observed in the preliminary data </w:t>
+      </w:r>
+      <w:r>
+        <w:rPr>
+          <w:rFonts w:asciiTheme="majorBidi" w:hAnsiTheme="majorBidi" w:cstheme="majorBidi"/>
+        </w:rPr>
+        <w:t>(r = 0.93), cytokine and chemokine levels</w:t>
+      </w:r>
+      <w:r>
+        <w:rPr>
+          <w:rFonts w:asciiTheme="majorBidi" w:hAnsiTheme="majorBidi" w:cstheme="majorBidi"/>
+        </w:rPr>
+        <w:t xml:space="preserve"> (IL-6, TNF-</w:t>
+      </w:r>
+      <w:r>
+        <w:rPr>
+          <w:rFonts w:asciiTheme="majorBidi" w:hAnsiTheme="majorBidi" w:cstheme="majorBidi"/>
+        </w:rPr>
+        <w:t xml:space="preserve"> </w:t>
+      </w:r>
+      <w:r>
+        <w:rPr>
+          <w:rFonts w:asciiTheme="majorBidi" w:hAnsiTheme="majorBidi" w:cstheme="majorBidi"/>
+        </w:rPr>
+        <w:t>α</w:t>
+      </w:r>
+      <w:r>
+        <w:rPr>
+          <w:rFonts w:asciiTheme="majorBidi" w:hAnsiTheme="majorBidi" w:cstheme="majorBidi"/>
+        </w:rPr>
+        <w:t>, MCP-1, Eotaxin-1)</w:t>
+      </w:r>
+      <w:r>
+        <w:rPr>
+          <w:rFonts w:asciiTheme="majorBidi" w:hAnsiTheme="majorBidi" w:cstheme="majorBidi"/>
+        </w:rPr>
+        <w:t xml:space="preserve"> will be modeled separately to avoid </w:t>
+      </w:r>
+      <w:r>
+        <w:rPr>
+          <w:rFonts w:asciiTheme="majorBidi" w:hAnsiTheme="majorBidi" w:cstheme="majorBidi"/>
+        </w:rPr>
+        <w:t xml:space="preserve">potential </w:t>
+      </w:r>
+      <w:r>
+        <w:rPr>
+          <w:rFonts w:asciiTheme="majorBidi" w:hAnsiTheme="majorBidi" w:cstheme="majorBidi"/>
+        </w:rPr>
+        <w:t>multicollinearity. This results in four models per outcome,</w:t>
+      </w:r>
+      <w:r>
+        <w:rPr>
+          <w:rFonts w:asciiTheme="majorBidi" w:hAnsiTheme="majorBidi" w:cstheme="majorBidi"/>
+        </w:rPr>
+        <w:t xml:space="preserve"> one for each marker,</w:t>
+      </w:r>
+      <w:r>
+        <w:rPr>
+          <w:rFonts w:asciiTheme="majorBidi" w:hAnsiTheme="majorBidi" w:cstheme="majorBidi"/>
+        </w:rPr>
+        <w:t xml:space="preserve"> for a total of 24 models</w:t>
+      </w:r>
+      <w:r>
+        <w:rPr>
+          <w:rFonts w:asciiTheme="majorBidi" w:hAnsiTheme="majorBidi" w:cstheme="majorBidi"/>
+        </w:rPr>
+        <w:t xml:space="preserve"> for each sub-aim</w:t>
+      </w:r>
+      <w:r>
+        <w:rPr>
+          <w:rFonts w:asciiTheme="majorBidi" w:hAnsiTheme="majorBidi" w:cstheme="majorBidi"/>
+        </w:rPr>
+        <w:t>. For</w:t>
+      </w:r>
+      <w:r>
+        <w:rPr>
+          <w:rFonts w:asciiTheme="majorBidi" w:hAnsiTheme="majorBidi" w:cstheme="majorBidi"/>
+        </w:rPr>
+        <w:t xml:space="preserve"> hypothesis</w:t>
+      </w:r>
+      <w:r>
+        <w:rPr>
+          <w:rFonts w:asciiTheme="majorBidi" w:hAnsiTheme="majorBidi" w:cstheme="majorBidi"/>
+        </w:rPr>
+        <w:t xml:space="preserve"> 1a, the predictors of interest will be </w:t>
+      </w:r>
+      <w:r>
+        <w:rPr>
+          <w:rFonts w:asciiTheme="majorBidi" w:hAnsiTheme="majorBidi" w:cstheme="majorBidi"/>
+        </w:rPr>
+        <w:t>the inflammatory markers at baseline</w:t>
+      </w:r>
+      <w:r>
+        <w:rPr>
+          <w:rFonts w:asciiTheme="majorBidi" w:hAnsiTheme="majorBidi" w:cstheme="majorBidi"/>
+        </w:rPr>
+        <w:t xml:space="preserve">. For 1b, the predictors of interest will be the change in </w:t>
+      </w:r>
+      <w:r>
+        <w:rPr>
+          <w:rFonts w:asciiTheme="majorBidi" w:hAnsiTheme="majorBidi" w:cstheme="majorBidi"/>
+        </w:rPr>
+        <w:t>the inflammatory markers</w:t>
+      </w:r>
+      <w:r>
+        <w:rPr>
+          <w:rFonts w:asciiTheme="majorBidi" w:hAnsiTheme="majorBidi" w:cstheme="majorBidi"/>
+        </w:rPr>
+        <w:t xml:space="preserve"> from baseline to one-year follow-up.</w:t>
+      </w:r>
+      <w:r>
+        <w:rPr>
+          <w:rFonts w:asciiTheme="majorBidi" w:hAnsiTheme="majorBidi" w:cstheme="majorBidi"/>
+        </w:rPr>
+        <w:t xml:space="preserve"> </w:t>
+      </w:r>
+      <w:r>
+        <w:rPr>
+          <w:rFonts w:asciiTheme="majorBidi" w:hAnsiTheme="majorBidi" w:cstheme="majorBidi"/>
+        </w:rPr>
+        <w:t>Statistical significance will be evaluated at α = 0.05.</w:t>
+      </w:r>
+    </w:p>
+    <w:p>
+      <w:pPr>
+        <w:spacing w:after="0" w:line="480" w:lineRule="auto"/>
+        <w:rPr>
+          <w:rFonts w:asciiTheme="majorBidi" w:hAnsiTheme="majorBidi" w:cstheme="majorBidi"/>
+        </w:rPr>
+      </w:pPr>
       <w:r>
         <w:rPr>
           <w:rFonts w:asciiTheme="majorBidi" w:hAnsiTheme="majorBidi" w:cstheme="majorBidi"/>
           <w:b/>
           <w:bCs/>
         </w:rPr>
-        <w:t xml:space="preserve"> Aim 1 Analytical Plan</w:t>
-      </w:r>
+        <w:t>C.6.b. Aim 2 Analytical Plan:</w:t>
+      </w:r>
+    </w:p>
+    <w:p>
+      <w:pPr>
+        <w:spacing w:after="0" w:line="480" w:lineRule="auto"/>
+        <w:rPr>
+          <w:rFonts w:asciiTheme="majorBidi" w:hAnsiTheme="majorBidi" w:cstheme="majorBidi"/>
+        </w:rPr>
+      </w:pPr>
+      <w:r>
+        <w:rPr>
+          <w:rFonts w:asciiTheme="majorBidi" w:hAnsiTheme="majorBidi" w:cstheme="majorBidi"/>
+        </w:rPr>
+        <w:t xml:space="preserve">We will fit separate </w:t>
+      </w:r>
+      <w:r>
+        <w:rPr>
+          <w:rFonts w:asciiTheme="majorBidi" w:hAnsiTheme="majorBidi" w:cstheme="majorBidi"/>
+        </w:rPr>
+        <w:t xml:space="preserve">multiple linear regression </w:t>
+      </w:r>
+      <w:r>
+        <w:rPr>
+          <w:rFonts w:asciiTheme="majorBidi" w:hAnsiTheme="majorBidi" w:cstheme="majorBidi"/>
+        </w:rPr>
+        <w:t xml:space="preserve">models for each of the six </w:t>
+      </w:r>
+      <w:r>
+        <w:rPr>
+          <w:rFonts w:asciiTheme="majorBidi" w:hAnsiTheme="majorBidi" w:cstheme="majorBidi"/>
+        </w:rPr>
+        <w:t xml:space="preserve">continuous </w:t>
+      </w:r>
+      <w:r>
+        <w:rPr>
+          <w:rFonts w:asciiTheme="majorBidi" w:hAnsiTheme="majorBidi" w:cstheme="majorBidi"/>
+        </w:rPr>
+        <w:t xml:space="preserve">outcomes of interest, the five cognitive measures (listed in Table 3) and cortical thickness. </w:t>
+      </w:r>
+      <w:r>
+        <w:rPr>
+          <w:rFonts w:asciiTheme="majorBidi" w:hAnsiTheme="majorBidi" w:cstheme="majorBidi"/>
+        </w:rPr>
+        <w:t>Similar to Aim 1, e</w:t>
+      </w:r>
+      <w:r>
+        <w:rPr>
+          <w:rFonts w:asciiTheme="majorBidi" w:hAnsiTheme="majorBidi" w:cstheme="majorBidi"/>
+        </w:rPr>
+        <w:t>ach</w:t>
+      </w:r>
+      <w:r>
+        <w:rPr>
+          <w:rFonts w:asciiTheme="majorBidi" w:hAnsiTheme="majorBidi" w:cstheme="majorBidi"/>
+        </w:rPr>
+        <w:t xml:space="preserve"> model will examine change from baseline to one-year follow-up in the respective outcome </w:t>
+      </w:r>
+      <w:r>
+        <w:rPr>
+          <w:rFonts w:asciiTheme="majorBidi" w:hAnsiTheme="majorBidi" w:cstheme="majorBidi"/>
+        </w:rPr>
+        <w:t xml:space="preserve">while </w:t>
+      </w:r>
+      <w:r>
+        <w:rPr>
+          <w:rFonts w:asciiTheme="majorBidi" w:hAnsiTheme="majorBidi" w:cstheme="majorBidi"/>
+        </w:rPr>
+        <w:t xml:space="preserve">adjusting for the corresponding baseline outcome value, age, sex, </w:t>
+      </w:r>
+      <w:r>
+        <w:rPr>
+          <w:rFonts w:asciiTheme="majorBidi" w:hAnsiTheme="majorBidi" w:cstheme="majorBidi"/>
+        </w:rPr>
+        <w:t xml:space="preserve">and </w:t>
+      </w:r>
+      <w:r>
+        <w:rPr>
+          <w:rFonts w:asciiTheme="majorBidi" w:hAnsiTheme="majorBidi" w:cstheme="majorBidi"/>
+        </w:rPr>
+        <w:t xml:space="preserve">APOE genotype. </w:t>
+      </w:r>
+      <w:r>
+        <w:rPr>
+          <w:rFonts w:asciiTheme="majorBidi" w:hAnsiTheme="majorBidi" w:cstheme="majorBidi"/>
+        </w:rPr>
+        <w:t>Additionally, e</w:t>
+      </w:r>
+      <w:r>
+        <w:rPr>
+          <w:rFonts w:asciiTheme="majorBidi" w:hAnsiTheme="majorBidi" w:cstheme="majorBidi"/>
+        </w:rPr>
+        <w:t>ach model will include an interaction term between each inflammatory marker and amyloid status (positive vs. negative), along with the main effects of each</w:t>
+      </w:r>
+      <w:r>
+        <w:rPr>
+          <w:rFonts w:asciiTheme="majorBidi" w:hAnsiTheme="majorBidi" w:cstheme="majorBidi"/>
+        </w:rPr>
+        <w:t>, while adjusting for SUVR global score</w:t>
+      </w:r>
+      <w:r>
+        <w:rPr>
+          <w:rFonts w:asciiTheme="majorBidi" w:hAnsiTheme="majorBidi" w:cstheme="majorBidi"/>
+        </w:rPr>
+        <w:t>.</w:t>
+      </w:r>
+      <w:r>
+        <w:t xml:space="preserve"> </w:t>
+      </w:r>
+      <w:r>
+        <w:rPr>
+          <w:rFonts w:asciiTheme="majorBidi" w:hAnsiTheme="majorBidi" w:cstheme="majorBidi"/>
+        </w:rPr>
+        <w:t xml:space="preserve">Additional potential confounders will be assessed. </w:t>
+      </w:r>
+      <w:r>
+        <w:rPr>
+          <w:rFonts w:asciiTheme="majorBidi" w:hAnsiTheme="majorBidi" w:cstheme="majorBidi"/>
+        </w:rPr>
+        <w:t xml:space="preserve">The primary test of interest in each model is the interaction term between the inflammatory marker and amyloid </w:t>
+      </w:r>
+      <w:r>
+        <w:rPr>
+          <w:rFonts w:asciiTheme="majorBidi" w:hAnsiTheme="majorBidi" w:cstheme="majorBidi"/>
+        </w:rPr>
+        <w:lastRenderedPageBreak/>
+        <w:t>status, which evaluates whether the association between inflammation and cognitive or cortical change differs by amyloid deposition status.</w:t>
+      </w:r>
+    </w:p>
+    <w:p>
+      <w:pPr>
+        <w:spacing w:after="0" w:line="480" w:lineRule="auto"/>
+        <w:rPr>
+          <w:rFonts w:asciiTheme="majorBidi" w:hAnsiTheme="majorBidi" w:cstheme="majorBidi"/>
+        </w:rPr>
+      </w:pPr>
       <w:r>
         <w:rPr>
           <w:rFonts w:asciiTheme="majorBidi" w:hAnsiTheme="majorBidi" w:cstheme="majorBidi"/>
           <w:b/>
           <w:bCs/>
         </w:rPr>
-        <w:t>:</w:t>
+        <w:t>D. Power Analysis and Additional Statistical Considerations</w:t>
       </w:r>
     </w:p>
     <w:p>
@@ -100,73 +422,25 @@
         <w:rPr>
           <w:rFonts w:asciiTheme="majorBidi" w:hAnsiTheme="majorBidi" w:cstheme="majorBidi"/>
         </w:rPr>
-        <w:t xml:space="preserve">We will fit separate </w:t>
-      </w:r>
-      <w:r>
-        <w:rPr>
-          <w:rFonts w:asciiTheme="majorBidi" w:hAnsiTheme="majorBidi" w:cstheme="majorBidi"/>
-        </w:rPr>
-        <w:t xml:space="preserve">multiple </w:t>
-      </w:r>
-      <w:r>
-        <w:rPr>
-          <w:rFonts w:asciiTheme="majorBidi" w:hAnsiTheme="majorBidi" w:cstheme="majorBidi"/>
-        </w:rPr>
-        <w:t xml:space="preserve">linear regression models for each of the six </w:t>
-      </w:r>
-      <w:r>
-        <w:rPr>
-          <w:rFonts w:asciiTheme="majorBidi" w:hAnsiTheme="majorBidi" w:cstheme="majorBidi"/>
-        </w:rPr>
-        <w:t xml:space="preserve">continuous </w:t>
-      </w:r>
-      <w:r>
-        <w:rPr>
-          <w:rFonts w:asciiTheme="majorBidi" w:hAnsiTheme="majorBidi" w:cstheme="majorBidi"/>
-        </w:rPr>
-        <w:t xml:space="preserve">outcomes of interest, the five cognitive measures (listed in Table 3) and cortical thickness. Each model will examine change from baseline to one-year follow-up in the respective outcome, while adjusting for the corresponding baseline outcome value, age, sex, and APOE genotype. </w:t>
-      </w:r>
-      <w:r>
-        <w:rPr>
-          <w:rFonts w:asciiTheme="majorBidi" w:hAnsiTheme="majorBidi" w:cstheme="majorBidi"/>
-        </w:rPr>
-        <w:t xml:space="preserve">Additional potential confounders will be assessed. </w:t>
-      </w:r>
-      <w:r>
-        <w:rPr>
-          <w:rFonts w:asciiTheme="majorBidi" w:hAnsiTheme="majorBidi" w:cstheme="majorBidi"/>
-        </w:rPr>
-        <w:t xml:space="preserve">Due to high collinearity between </w:t>
-      </w:r>
-      <w:r>
-        <w:rPr>
-          <w:rFonts w:asciiTheme="majorBidi" w:hAnsiTheme="majorBidi" w:cstheme="majorBidi"/>
-        </w:rPr>
-        <w:t>two of the</w:t>
-      </w:r>
-      <w:r>
-        <w:rPr>
-          <w:rFonts w:asciiTheme="majorBidi" w:hAnsiTheme="majorBidi" w:cstheme="majorBidi"/>
-        </w:rPr>
-        <w:t xml:space="preserve"> inflammation markers of interest </w:t>
-      </w:r>
-      <w:r>
-        <w:rPr>
-          <w:rFonts w:asciiTheme="majorBidi" w:hAnsiTheme="majorBidi" w:cstheme="majorBidi"/>
-        </w:rPr>
-        <w:t xml:space="preserve">observed in the preliminary data </w:t>
-      </w:r>
-      <w:r>
-        <w:rPr>
-          <w:rFonts w:asciiTheme="majorBidi" w:hAnsiTheme="majorBidi" w:cstheme="majorBidi"/>
-        </w:rPr>
-        <w:t>(r = 0.93), cytokine and chemokine levels</w:t>
-      </w:r>
-      <w:r>
-        <w:rPr>
-          <w:rFonts w:asciiTheme="majorBidi" w:hAnsiTheme="majorBidi" w:cstheme="majorBidi"/>
-        </w:rPr>
-        <w:t xml:space="preserve"> (IL-6, TNF-</w:t>
+        <w:t>Power analyses were conducted in R using the powertools package. For Aim 1, power was calculated for a test of a single correlation coefficient using the corr.1samp function, assuming a sample size of 175 and a range of expected effect sizes (0.20 to 0.70) informed by preliminary data</w:t>
+      </w:r>
+      <w:r>
+        <w:rPr>
+          <w:rFonts w:asciiTheme="majorBidi" w:hAnsiTheme="majorBidi" w:cstheme="majorBidi"/>
+        </w:rPr>
+        <w:t xml:space="preserve"> (results displayed in Figure 1)</w:t>
+      </w:r>
+      <w:r>
+        <w:rPr>
+          <w:rFonts w:asciiTheme="majorBidi" w:hAnsiTheme="majorBidi" w:cstheme="majorBidi"/>
+        </w:rPr>
+        <w:t>.</w:t>
+      </w:r>
+      <w:r>
+        <w:rPr>
+          <w:rFonts w:asciiTheme="majorBidi" w:hAnsiTheme="majorBidi" w:cstheme="majorBidi"/>
+        </w:rPr>
+        <w:t xml:space="preserve"> All tests were two-sided and</w:t>
       </w:r>
       <w:r>
         <w:rPr>
@@ -178,91 +452,63 @@
         <w:rPr>
           <w:rFonts w:asciiTheme="majorBidi" w:hAnsiTheme="majorBidi" w:cstheme="majorBidi"/>
         </w:rPr>
-        <w:t>α</w:t>
-      </w:r>
-      <w:r>
-        <w:rPr>
-          <w:rFonts w:asciiTheme="majorBidi" w:hAnsiTheme="majorBidi" w:cstheme="majorBidi"/>
-        </w:rPr>
-        <w:t>, MCP-1, Eotaxin-1)</w:t>
-      </w:r>
-      <w:r>
-        <w:rPr>
-          <w:rFonts w:asciiTheme="majorBidi" w:hAnsiTheme="majorBidi" w:cstheme="majorBidi"/>
-        </w:rPr>
-        <w:t xml:space="preserve"> will be modeled separately to avoid </w:t>
-      </w:r>
-      <w:r>
-        <w:rPr>
-          <w:rFonts w:asciiTheme="majorBidi" w:hAnsiTheme="majorBidi" w:cstheme="majorBidi"/>
-        </w:rPr>
-        <w:t xml:space="preserve">potential </w:t>
-      </w:r>
-      <w:r>
-        <w:rPr>
-          <w:rFonts w:asciiTheme="majorBidi" w:hAnsiTheme="majorBidi" w:cstheme="majorBidi"/>
-        </w:rPr>
-        <w:t>multicollinearity. This results in four models per outcome,</w:t>
-      </w:r>
-      <w:r>
-        <w:rPr>
-          <w:rFonts w:asciiTheme="majorBidi" w:hAnsiTheme="majorBidi" w:cstheme="majorBidi"/>
-        </w:rPr>
-        <w:t xml:space="preserve"> one for each marker,</w:t>
-      </w:r>
-      <w:r>
-        <w:rPr>
-          <w:rFonts w:asciiTheme="majorBidi" w:hAnsiTheme="majorBidi" w:cstheme="majorBidi"/>
-        </w:rPr>
-        <w:t xml:space="preserve"> for a total of 24 models</w:t>
-      </w:r>
-      <w:r>
-        <w:rPr>
-          <w:rFonts w:asciiTheme="majorBidi" w:hAnsiTheme="majorBidi" w:cstheme="majorBidi"/>
-        </w:rPr>
-        <w:t xml:space="preserve"> for each sub-aim</w:t>
-      </w:r>
-      <w:r>
-        <w:rPr>
-          <w:rFonts w:asciiTheme="majorBidi" w:hAnsiTheme="majorBidi" w:cstheme="majorBidi"/>
-        </w:rPr>
-        <w:t>. For</w:t>
-      </w:r>
-      <w:r>
-        <w:rPr>
-          <w:rFonts w:asciiTheme="majorBidi" w:hAnsiTheme="majorBidi" w:cstheme="majorBidi"/>
-        </w:rPr>
-        <w:t xml:space="preserve"> hypothesis</w:t>
-      </w:r>
-      <w:r>
-        <w:rPr>
-          <w:rFonts w:asciiTheme="majorBidi" w:hAnsiTheme="majorBidi" w:cstheme="majorBidi"/>
-        </w:rPr>
-        <w:t xml:space="preserve"> 1a, the predictors of interest will be </w:t>
-      </w:r>
-      <w:r>
-        <w:rPr>
-          <w:rFonts w:asciiTheme="majorBidi" w:hAnsiTheme="majorBidi" w:cstheme="majorBidi"/>
-        </w:rPr>
-        <w:t>the inflammatory markers at baseline</w:t>
-      </w:r>
-      <w:r>
-        <w:rPr>
-          <w:rFonts w:asciiTheme="majorBidi" w:hAnsiTheme="majorBidi" w:cstheme="majorBidi"/>
-        </w:rPr>
-        <w:t xml:space="preserve">. For 1b, the predictors of interest will be the change in </w:t>
-      </w:r>
-      <w:r>
-        <w:rPr>
-          <w:rFonts w:asciiTheme="majorBidi" w:hAnsiTheme="majorBidi" w:cstheme="majorBidi"/>
-        </w:rPr>
-        <w:t>the inflammatory markers</w:t>
-      </w:r>
-      <w:r>
-        <w:rPr>
-          <w:rFonts w:asciiTheme="majorBidi" w:hAnsiTheme="majorBidi" w:cstheme="majorBidi"/>
-        </w:rPr>
-        <w:t xml:space="preserve"> from baseline to one-year follow-up.</w:t>
+        <w:t>t</w:t>
+      </w:r>
+      <w:r>
+        <w:rPr>
+          <w:rFonts w:asciiTheme="majorBidi" w:hAnsiTheme="majorBidi" w:cstheme="majorBidi"/>
+        </w:rPr>
+        <w:t xml:space="preserve">hree alpha levels were examined to account for multiple comparisons: α = 0.05/4 (correcting for the number of markers per outcome), α = 0.05/6 (correcting for the number of outcomes), and α = 0.05/24 (correcting for all models). </w:t>
+      </w:r>
+      <w:r>
+        <w:rPr>
+          <w:rFonts w:asciiTheme="majorBidi" w:hAnsiTheme="majorBidi" w:cstheme="majorBidi"/>
+        </w:rPr>
+        <w:t>Power r</w:t>
+      </w:r>
+      <w:r>
+        <w:rPr>
+          <w:rFonts w:asciiTheme="majorBidi" w:hAnsiTheme="majorBidi" w:cstheme="majorBidi"/>
+        </w:rPr>
+        <w:t xml:space="preserve">esults are summarized below in Table 1. </w:t>
+      </w:r>
+      <w:r>
+        <w:rPr>
+          <w:rFonts w:asciiTheme="majorBidi" w:hAnsiTheme="majorBidi" w:cstheme="majorBidi"/>
+        </w:rPr>
+        <w:t>Power results indicate that the study is powered to detect moderate correlations (approximately ≥ 0.3) between inflammatory markers and longitudinal changes in outcomes with at least 80% power, depending on the significance threshold.</w:t>
+      </w:r>
+    </w:p>
+    <w:p>
+      <w:pPr>
+        <w:spacing w:after="0" w:line="480" w:lineRule="auto"/>
+        <w:rPr>
+          <w:rFonts w:asciiTheme="majorBidi" w:hAnsiTheme="majorBidi" w:cstheme="majorBidi"/>
+        </w:rPr>
+      </w:pPr>
+      <w:r>
+        <w:rPr>
+          <w:rFonts w:asciiTheme="majorBidi" w:hAnsiTheme="majorBidi" w:cstheme="majorBidi"/>
+        </w:rPr>
+        <w:t xml:space="preserve">For Aim 2, power was calculated for a test of the difference between two correlation coefficients using the corr.2samp function, reflecting the interaction between each inflammatory marker and amyloid status. </w:t>
+      </w:r>
+      <w:r>
+        <w:rPr>
+          <w:rFonts w:asciiTheme="majorBidi" w:hAnsiTheme="majorBidi" w:cstheme="majorBidi"/>
+        </w:rPr>
+        <w:t xml:space="preserve">All tests were two-sided and the same three significance levels as Aim 1 were applied. Given uncertainty in the expected prevalence of amyloid positivity in this sample, power was evaluated across a range of amyloid positive group sizes (N+ = 25, 56, 88, 120, 150), with the corresponding amyloid negative group sizes (N- = 175 – N+). The two most extreme group sizes did not achieve 80% power within the range of effect sizes examined. The minimum detectable difference in correlations at 80% power for the remaining group size scenarios </w:t>
+      </w:r>
+      <w:r>
+        <w:rPr>
+          <w:rFonts w:asciiTheme="majorBidi" w:hAnsiTheme="majorBidi" w:cstheme="majorBidi"/>
+        </w:rPr>
+        <w:t>is</w:t>
+      </w:r>
+      <w:r>
+        <w:rPr>
+          <w:rFonts w:asciiTheme="majorBidi" w:hAnsiTheme="majorBidi" w:cstheme="majorBidi"/>
+        </w:rPr>
+        <w:t xml:space="preserve"> reported in Table 2.</w:t>
       </w:r>
       <w:r>
         <w:rPr>
@@ -274,7 +520,14 @@
         <w:rPr>
           <w:rFonts w:asciiTheme="majorBidi" w:hAnsiTheme="majorBidi" w:cstheme="majorBidi"/>
         </w:rPr>
-        <w:t>Statistical significance will be evaluated at α = 0.05.</w:t>
+        <w:t xml:space="preserve">Power did not reach 80% for the smallest and largest amyloid-positive group sizes examined. For the remaining group size scenarios, the minimum detectable difference in </w:t>
+      </w:r>
+      <w:r>
+        <w:rPr>
+          <w:rFonts w:asciiTheme="majorBidi" w:hAnsiTheme="majorBidi" w:cstheme="majorBidi"/>
+        </w:rPr>
+        <w:lastRenderedPageBreak/>
+        <w:t>correlations at 80% power was approximately 0.4–0.5 across the examined α levels, indicating that the study is powered to detect moderate-to-large interaction effects.</w:t>
       </w:r>
     </w:p>
     <w:p>
@@ -284,249 +537,25 @@
           <w:rFonts w:asciiTheme="majorBidi" w:hAnsiTheme="majorBidi" w:cstheme="majorBidi"/>
         </w:rPr>
       </w:pPr>
-      <w:r>
+    </w:p>
+    <w:p>
+      <w:pPr>
+        <w:spacing w:after="0" w:line="480" w:lineRule="auto"/>
         <w:rPr>
           <w:rFonts w:asciiTheme="majorBidi" w:hAnsiTheme="majorBidi" w:cstheme="majorBidi"/>
           <w:b/>
           <w:bCs/>
         </w:rPr>
-        <w:t>C.6.b. Aim 2 Analytical Plan:</w:t>
-      </w:r>
+      </w:pPr>
     </w:p>
     <w:p>
       <w:pPr>
         <w:spacing w:after="0" w:line="480" w:lineRule="auto"/>
-        <w:rPr>
-          <w:rFonts w:asciiTheme="majorBidi" w:hAnsiTheme="majorBidi" w:cstheme="majorBidi"/>
-        </w:rPr>
-      </w:pPr>
-      <w:r>
-        <w:rPr>
-          <w:rFonts w:asciiTheme="majorBidi" w:hAnsiTheme="majorBidi" w:cstheme="majorBidi"/>
-        </w:rPr>
-        <w:t xml:space="preserve">We will fit separate </w:t>
-      </w:r>
-      <w:r>
-        <w:rPr>
-          <w:rFonts w:asciiTheme="majorBidi" w:hAnsiTheme="majorBidi" w:cstheme="majorBidi"/>
-        </w:rPr>
-        <w:t xml:space="preserve">multiple linear regression </w:t>
-      </w:r>
-      <w:r>
-        <w:rPr>
-          <w:rFonts w:asciiTheme="majorBidi" w:hAnsiTheme="majorBidi" w:cstheme="majorBidi"/>
-        </w:rPr>
-        <w:t xml:space="preserve">models for each of the six </w:t>
-      </w:r>
-      <w:r>
-        <w:rPr>
-          <w:rFonts w:asciiTheme="majorBidi" w:hAnsiTheme="majorBidi" w:cstheme="majorBidi"/>
-        </w:rPr>
-        <w:t xml:space="preserve">continuous </w:t>
-      </w:r>
-      <w:r>
-        <w:rPr>
-          <w:rFonts w:asciiTheme="majorBidi" w:hAnsiTheme="majorBidi" w:cstheme="majorBidi"/>
-        </w:rPr>
-        <w:t xml:space="preserve">outcomes of interest, the five cognitive measures (listed in Table 3) and cortical thickness. </w:t>
-      </w:r>
-      <w:r>
-        <w:rPr>
-          <w:rFonts w:asciiTheme="majorBidi" w:hAnsiTheme="majorBidi" w:cstheme="majorBidi"/>
-        </w:rPr>
-        <w:t>Similar to Aim 1, e</w:t>
-      </w:r>
-      <w:r>
-        <w:rPr>
-          <w:rFonts w:asciiTheme="majorBidi" w:hAnsiTheme="majorBidi" w:cstheme="majorBidi"/>
-        </w:rPr>
-        <w:t>ach</w:t>
-      </w:r>
-      <w:r>
-        <w:rPr>
-          <w:rFonts w:asciiTheme="majorBidi" w:hAnsiTheme="majorBidi" w:cstheme="majorBidi"/>
-        </w:rPr>
-        <w:t xml:space="preserve"> model will examine change from baseline to one-year follow-up in the respective outcome </w:t>
-      </w:r>
-      <w:r>
-        <w:rPr>
-          <w:rFonts w:asciiTheme="majorBidi" w:hAnsiTheme="majorBidi" w:cstheme="majorBidi"/>
-        </w:rPr>
-        <w:t xml:space="preserve">while </w:t>
-      </w:r>
-      <w:r>
-        <w:rPr>
-          <w:rFonts w:asciiTheme="majorBidi" w:hAnsiTheme="majorBidi" w:cstheme="majorBidi"/>
-        </w:rPr>
-        <w:t xml:space="preserve">adjusting for the corresponding baseline outcome value, age, sex, </w:t>
-      </w:r>
-      <w:r>
-        <w:rPr>
-          <w:rFonts w:asciiTheme="majorBidi" w:hAnsiTheme="majorBidi" w:cstheme="majorBidi"/>
-        </w:rPr>
-        <w:t xml:space="preserve">and </w:t>
-      </w:r>
-      <w:r>
-        <w:rPr>
-          <w:rFonts w:asciiTheme="majorBidi" w:hAnsiTheme="majorBidi" w:cstheme="majorBidi"/>
-        </w:rPr>
-        <w:t xml:space="preserve">APOE genotype. </w:t>
-      </w:r>
-      <w:r>
-        <w:rPr>
-          <w:rFonts w:asciiTheme="majorBidi" w:hAnsiTheme="majorBidi" w:cstheme="majorBidi"/>
-        </w:rPr>
-        <w:t>Additionally, e</w:t>
-      </w:r>
-      <w:r>
-        <w:rPr>
-          <w:rFonts w:asciiTheme="majorBidi" w:hAnsiTheme="majorBidi" w:cstheme="majorBidi"/>
-        </w:rPr>
-        <w:t>ach model will include an interaction term between each inflammatory marker and amyloid status (positive vs. negative), along with the main effects of each</w:t>
-      </w:r>
-      <w:r>
-        <w:rPr>
-          <w:rFonts w:asciiTheme="majorBidi" w:hAnsiTheme="majorBidi" w:cstheme="majorBidi"/>
-        </w:rPr>
-        <w:t>, while adjusting for SUVR global score</w:t>
-      </w:r>
-      <w:r>
-        <w:rPr>
-          <w:rFonts w:asciiTheme="majorBidi" w:hAnsiTheme="majorBidi" w:cstheme="majorBidi"/>
-        </w:rPr>
-        <w:t>.</w:t>
-      </w:r>
-      <w:r>
-        <w:t xml:space="preserve"> </w:t>
-      </w:r>
-      <w:r>
-        <w:rPr>
-          <w:rFonts w:asciiTheme="majorBidi" w:hAnsiTheme="majorBidi" w:cstheme="majorBidi"/>
-        </w:rPr>
-        <w:t xml:space="preserve">Additional potential confounders will be assessed. </w:t>
-      </w:r>
-      <w:r>
-        <w:rPr>
-          <w:rFonts w:asciiTheme="majorBidi" w:hAnsiTheme="majorBidi" w:cstheme="majorBidi"/>
-        </w:rPr>
-        <w:t xml:space="preserve">The primary test of interest in each model is the interaction term between the inflammatory marker and amyloid </w:t>
-      </w:r>
-      <w:r>
-        <w:rPr>
-          <w:rFonts w:asciiTheme="majorBidi" w:hAnsiTheme="majorBidi" w:cstheme="majorBidi"/>
-        </w:rPr>
-        <w:lastRenderedPageBreak/>
-        <w:t>status, which evaluates whether the association between inflammation and cognitive or cortical change differs by amyloid deposition status.</w:t>
-      </w:r>
-    </w:p>
-    <w:p>
-      <w:pPr>
-        <w:spacing w:after="0" w:line="480" w:lineRule="auto"/>
-        <w:rPr>
-          <w:rFonts w:asciiTheme="majorBidi" w:hAnsiTheme="majorBidi" w:cstheme="majorBidi"/>
-        </w:rPr>
-      </w:pPr>
-      <w:r>
         <w:rPr>
           <w:rFonts w:asciiTheme="majorBidi" w:hAnsiTheme="majorBidi" w:cstheme="majorBidi"/>
           <w:b/>
           <w:bCs/>
         </w:rPr>
-        <w:t>D. Power Analysis and Additional Statistical Considerations</w:t>
-      </w:r>
-    </w:p>
-    <w:p>
-      <w:pPr>
-        <w:spacing w:after="0" w:line="480" w:lineRule="auto"/>
-        <w:rPr>
-          <w:rFonts w:asciiTheme="majorBidi" w:hAnsiTheme="majorBidi" w:cstheme="majorBidi"/>
-        </w:rPr>
-      </w:pPr>
-      <w:r>
-        <w:rPr>
-          <w:rFonts w:asciiTheme="majorBidi" w:hAnsiTheme="majorBidi" w:cstheme="majorBidi"/>
-        </w:rPr>
-        <w:t>Power analyses were conducted in R using the powertools package. For Aim 1, power was calculated for a test of a single correlation coefficient using the corr.1samp function, assuming a sample size of 175 and a range of expected effect sizes (0.20 to 0.70) informed by preliminary data</w:t>
-      </w:r>
-      <w:r>
-        <w:rPr>
-          <w:rFonts w:asciiTheme="majorBidi" w:hAnsiTheme="majorBidi" w:cstheme="majorBidi"/>
-        </w:rPr>
-        <w:t xml:space="preserve"> (results displayed in Figure 1)</w:t>
-      </w:r>
-      <w:r>
-        <w:rPr>
-          <w:rFonts w:asciiTheme="majorBidi" w:hAnsiTheme="majorBidi" w:cstheme="majorBidi"/>
-        </w:rPr>
-        <w:t>.</w:t>
-      </w:r>
-      <w:r>
-        <w:rPr>
-          <w:rFonts w:asciiTheme="majorBidi" w:hAnsiTheme="majorBidi" w:cstheme="majorBidi"/>
-        </w:rPr>
-        <w:t xml:space="preserve"> All tests were two-sided and</w:t>
-      </w:r>
-      <w:r>
-        <w:rPr>
-          <w:rFonts w:asciiTheme="majorBidi" w:hAnsiTheme="majorBidi" w:cstheme="majorBidi"/>
-        </w:rPr>
-        <w:t xml:space="preserve"> </w:t>
-      </w:r>
-      <w:r>
-        <w:rPr>
-          <w:rFonts w:asciiTheme="majorBidi" w:hAnsiTheme="majorBidi" w:cstheme="majorBidi"/>
-        </w:rPr>
-        <w:t>t</w:t>
-      </w:r>
-      <w:r>
-        <w:rPr>
-          <w:rFonts w:asciiTheme="majorBidi" w:hAnsiTheme="majorBidi" w:cstheme="majorBidi"/>
-        </w:rPr>
-        <w:t xml:space="preserve">hree alpha levels were examined to account for multiple comparisons: α = 0.05/4 (correcting for the number of markers per outcome), α = 0.05/6 (correcting for the number of outcomes), and α = 0.05/24 (correcting for all models). </w:t>
-      </w:r>
-      <w:r>
-        <w:rPr>
-          <w:rFonts w:asciiTheme="majorBidi" w:hAnsiTheme="majorBidi" w:cstheme="majorBidi"/>
-        </w:rPr>
-        <w:t>Power r</w:t>
-      </w:r>
-      <w:r>
-        <w:rPr>
-          <w:rFonts w:asciiTheme="majorBidi" w:hAnsiTheme="majorBidi" w:cstheme="majorBidi"/>
-        </w:rPr>
-        <w:t xml:space="preserve">esults are summarized below in Table 1. </w:t>
-      </w:r>
-      <w:r>
-        <w:rPr>
-          <w:rFonts w:asciiTheme="majorBidi" w:hAnsiTheme="majorBidi" w:cstheme="majorBidi"/>
-        </w:rPr>
-        <w:t xml:space="preserve">For Aim 2, power was calculated for a test of the difference between two correlation coefficients using the corr.2samp function, reflecting the interaction between each inflammatory marker and amyloid status. </w:t>
-      </w:r>
-      <w:r>
-        <w:rPr>
-          <w:rFonts w:asciiTheme="majorBidi" w:hAnsiTheme="majorBidi" w:cstheme="majorBidi"/>
-        </w:rPr>
-        <w:t xml:space="preserve">All tests were two-sided and the same three significance levels as Aim 1 were applied. Given uncertainty in the expected prevalence of amyloid positivity in this sample, power was evaluated across a range of amyloid positive group sizes (N+ = 25, 56, 88, 120, 150), with the corresponding amyloid negative group sizes (N- = 175 – N+). The two most extreme group sizes did not achieve 80% power within the range of effect sizes examined. The minimum detectable difference in correlations at 80% power for the remaining group size scenarios </w:t>
-      </w:r>
-      <w:r>
-        <w:rPr>
-          <w:rFonts w:asciiTheme="majorBidi" w:hAnsiTheme="majorBidi" w:cstheme="majorBidi"/>
-        </w:rPr>
-        <w:t>is</w:t>
-      </w:r>
-      <w:r>
-        <w:rPr>
-          <w:rFonts w:asciiTheme="majorBidi" w:hAnsiTheme="majorBidi" w:cstheme="majorBidi"/>
-        </w:rPr>
-        <w:t xml:space="preserve"> reported in Table 2.</w:t>
-      </w:r>
-    </w:p>
-    <w:p>
-      <w:pPr>
-        <w:spacing w:after="0" w:line="480" w:lineRule="auto"/>
-        <w:rPr>
-          <w:rFonts w:asciiTheme="majorBidi" w:hAnsiTheme="majorBidi" w:cstheme="majorBidi"/>
-        </w:rPr>
       </w:pPr>
     </w:p>
     <w:p>
@@ -544,35 +573,14 @@
         <w:spacing w:after="0" w:line="480" w:lineRule="auto"/>
         <w:rPr>
           <w:rFonts w:asciiTheme="majorBidi" w:hAnsiTheme="majorBidi" w:cstheme="majorBidi"/>
+        </w:rPr>
+      </w:pPr>
+      <w:r>
+        <w:rPr>
+          <w:rFonts w:asciiTheme="majorBidi" w:hAnsiTheme="majorBidi" w:cstheme="majorBidi"/>
           <w:b/>
           <w:bCs/>
         </w:rPr>
-      </w:pPr>
-    </w:p>
-    <w:p>
-      <w:pPr>
-        <w:spacing w:after="0" w:line="480" w:lineRule="auto"/>
-        <w:rPr>
-          <w:rFonts w:asciiTheme="majorBidi" w:hAnsiTheme="majorBidi" w:cstheme="majorBidi"/>
-          <w:b/>
-          <w:bCs/>
-        </w:rPr>
-      </w:pPr>
-    </w:p>
-    <w:p>
-      <w:pPr>
-        <w:spacing w:after="0" w:line="480" w:lineRule="auto"/>
-        <w:rPr>
-          <w:rFonts w:asciiTheme="majorBidi" w:hAnsiTheme="majorBidi" w:cstheme="majorBidi"/>
-        </w:rPr>
-      </w:pPr>
-      <w:r>
-        <w:rPr>
-          <w:rFonts w:asciiTheme="majorBidi" w:hAnsiTheme="majorBidi" w:cstheme="majorBidi"/>
-          <w:b/>
-          <w:bCs/>
-        </w:rPr>
-        <w:lastRenderedPageBreak/>
         <w:t>Figure 1.</w:t>
       </w:r>
       <w:r>
@@ -725,36 +733,6 @@
         <w:spacing w:line="480" w:lineRule="auto"/>
         <w:rPr>
           <w:rFonts w:asciiTheme="majorBidi" w:hAnsiTheme="majorBidi" w:cstheme="majorBidi"/>
-          <w:b/>
-          <w:bCs/>
-        </w:rPr>
-      </w:pPr>
-    </w:p>
-    <w:p>
-      <w:pPr>
-        <w:spacing w:line="480" w:lineRule="auto"/>
-        <w:rPr>
-          <w:rFonts w:asciiTheme="majorBidi" w:hAnsiTheme="majorBidi" w:cstheme="majorBidi"/>
-          <w:b/>
-          <w:bCs/>
-        </w:rPr>
-      </w:pPr>
-    </w:p>
-    <w:p>
-      <w:pPr>
-        <w:spacing w:line="480" w:lineRule="auto"/>
-        <w:rPr>
-          <w:rFonts w:asciiTheme="majorBidi" w:hAnsiTheme="majorBidi" w:cstheme="majorBidi"/>
-          <w:b/>
-          <w:bCs/>
-        </w:rPr>
-      </w:pPr>
-    </w:p>
-    <w:p>
-      <w:pPr>
-        <w:spacing w:line="480" w:lineRule="auto"/>
-        <w:rPr>
-          <w:rFonts w:asciiTheme="majorBidi" w:hAnsiTheme="majorBidi" w:cstheme="majorBidi"/>
         </w:rPr>
       </w:pPr>
       <w:r>
@@ -966,7 +944,7 @@
           <w:noProof/>
         </w:rPr>
         <w:drawing>
-          <wp:inline distT="0" distB="0" distL="0" distR="0" wp14:anchorId="3A67854D" wp14:editId="72DF4D89">
+          <wp:inline distT="0" distB="0" distL="0" distR="0" wp14:anchorId="3A67854D" wp14:editId="25E4D8DE">
             <wp:extent cx="3824654" cy="3445866"/>
             <wp:effectExtent l="0" t="0" r="0" b="0"/>
             <wp:docPr id="1441451717" name="Picture 5"/>
@@ -1082,43 +1060,7 @@
         <w:rPr>
           <w:rFonts w:ascii="Times New Roman" w:hAnsi="Times New Roman" w:cs="Times New Roman"/>
         </w:rPr>
-        <w:t>. All code can be found within the folder titled Project</w:t>
-      </w:r>
-      <w:r>
-        <w:rPr>
-          <w:rFonts w:ascii="Times New Roman" w:hAnsi="Times New Roman" w:cs="Times New Roman"/>
-        </w:rPr>
-        <w:t>2</w:t>
-      </w:r>
-      <w:r>
-        <w:rPr>
-          <w:rFonts w:ascii="Times New Roman" w:hAnsi="Times New Roman" w:cs="Times New Roman"/>
-        </w:rPr>
-        <w:t xml:space="preserve">/Code/. The </w:t>
-      </w:r>
-      <w:r>
-        <w:rPr>
-          <w:rFonts w:ascii="Times New Roman" w:hAnsi="Times New Roman" w:cs="Times New Roman"/>
-        </w:rPr>
-        <w:t>preliminary</w:t>
-      </w:r>
-      <w:r>
-        <w:rPr>
-          <w:rFonts w:ascii="Times New Roman" w:hAnsi="Times New Roman" w:cs="Times New Roman"/>
-        </w:rPr>
-        <w:t xml:space="preserve"> dataset can be found under Project</w:t>
-      </w:r>
-      <w:r>
-        <w:rPr>
-          <w:rFonts w:ascii="Times New Roman" w:hAnsi="Times New Roman" w:cs="Times New Roman"/>
-        </w:rPr>
-        <w:t>2</w:t>
-      </w:r>
-      <w:r>
-        <w:rPr>
-          <w:rFonts w:ascii="Times New Roman" w:hAnsi="Times New Roman" w:cs="Times New Roman"/>
-        </w:rPr>
-        <w:t>/</w:t>
+        <w:t>. All code can be found within the folder titled Project2/Code/. The preliminary dataset can be found under Project2/</w:t>
       </w:r>
       <w:r>
         <w:rPr>
@@ -1279,19 +1221,7 @@
       <w:rPr>
         <w:rFonts w:ascii="Times New Roman" w:hAnsi="Times New Roman" w:cs="Times New Roman"/>
       </w:rPr>
-      <w:t xml:space="preserve">March </w:t>
-    </w:r>
-    <w:r>
-      <w:rPr>
-        <w:rFonts w:ascii="Times New Roman" w:hAnsi="Times New Roman" w:cs="Times New Roman"/>
-      </w:rPr>
-      <w:t>30</w:t>
-    </w:r>
-    <w:r>
-      <w:rPr>
-        <w:rFonts w:ascii="Times New Roman" w:hAnsi="Times New Roman" w:cs="Times New Roman"/>
-      </w:rPr>
-      <w:t>, 2026</w:t>
+      <w:t>March 30, 2026</w:t>
     </w:r>
   </w:p>
 </w:hdr>

</xml_diff>